<commit_message>
pipeline completo: scripts 4, 5 e 6 + arquitetura atualizada
</commit_message>
<xml_diff>
--- a/arquitetura_projeto.docx
+++ b/arquitetura_projeto.docx
@@ -495,7 +495,7 @@
                 <w:sz w:val="18"/>
                 <w:szCs w:val="18"/>
               </w:rPr>
-              <w:t xml:space="preserve">Busca temas e autores via API para cada proposição. Checkpoint por parquet parcial.</w:t>
+              <w:t xml:space="preserve">Busca temas e autores via API para cada proposição. Checkpoint por parquet parcial a cada 250 props.</w:t>
             </w:r>
           </w:p>
         </w:tc>
@@ -667,7 +667,7 @@
                 <w:sz w:val="18"/>
                 <w:szCs w:val="18"/>
               </w:rPr>
-              <w:t xml:space="preserve">Agrupa apensadas, elege representante, funde campos. Unidade de atualização = grupo.</w:t>
+              <w:t xml:space="preserve">Agrupa apensadas via Union-Find, elege representante, funde campos, determina situação do grupo.</w:t>
             </w:r>
           </w:p>
         </w:tc>
@@ -695,7 +695,7 @@
                 <w:sz w:val="18"/>
                 <w:szCs w:val="18"/>
               </w:rPr>
-              <w:t xml:space="preserve">⏳ A fazer</w:t>
+              <w:t xml:space="preserve">✅ Concluído</w:t>
             </w:r>
           </w:p>
         </w:tc>
@@ -753,7 +753,7 @@
                 <w:sz w:val="18"/>
                 <w:szCs w:val="18"/>
               </w:rPr>
-              <w:t xml:space="preserve">Padroniza colunas, aplica 3 classes de situação, salva parquet final.</w:t>
+              <w:t xml:space="preserve">Seleciona colunas finais, normaliza tipos, salva base_legislativa.parquet em data/final/.</w:t>
             </w:r>
           </w:p>
         </w:tc>
@@ -781,7 +781,7 @@
                 <w:sz w:val="18"/>
                 <w:szCs w:val="18"/>
               </w:rPr>
-              <w:t xml:space="preserve">⏳ A fazer</w:t>
+              <w:t xml:space="preserve">✅ Concluído</w:t>
             </w:r>
           </w:p>
         </w:tc>
@@ -943,7 +943,7 @@
           <w:sz w:val="18"/>
           <w:szCs w:val="18"/>
         </w:rPr>
-        <w:t xml:space="preserve">data/final/        ← base final pronta para o dashboard</w:t>
+        <w:t xml:space="preserve">data/final/        ← base_legislativa.parquet — base final pronta para o dashboard</w:t>
       </w:r>
     </w:p>
     <w:p>
@@ -962,6 +962,634 @@
         <w:t xml:space="preserve">state/             ← registros de última atualização (JSON)</w:t>
       </w:r>
     </w:p>
+    <w:p>
+      <w:pPr>
+        <w:spacing w:after="0" w:before="120"/>
+      </w:pPr>
+      <w:r>
+        <w:t xml:space="preserve"/>
+      </w:r>
+    </w:p>
+    <w:p>
+      <w:pPr>
+        <w:pStyle w:val="Heading2"/>
+        <w:spacing w:after="120" w:before="280"/>
+      </w:pPr>
+      <w:r>
+        <w:rPr>
+          <w:rFonts w:ascii="Arial" w:cs="Arial" w:eastAsia="Arial" w:hAnsi="Arial"/>
+          <w:b/>
+          <w:bCs/>
+          <w:color w:val="2E75B6"/>
+          <w:sz w:val="26"/>
+          <w:szCs w:val="26"/>
+        </w:rPr>
+        <w:t xml:space="preserve">2.3 Estado atual da base final</w:t>
+      </w:r>
+    </w:p>
+    <w:tbl>
+      <w:tblPr>
+        <w:tblW w:type="dxa" w:w="8960"/>
+        <w:tblBorders>
+          <w:top w:val="single" w:color="auto" w:sz="4"/>
+          <w:left w:val="single" w:color="auto" w:sz="4"/>
+          <w:bottom w:val="single" w:color="auto" w:sz="4"/>
+          <w:right w:val="single" w:color="auto" w:sz="4"/>
+          <w:insideH w:val="single" w:color="auto" w:sz="4"/>
+          <w:insideV w:val="single" w:color="auto" w:sz="4"/>
+        </w:tblBorders>
+      </w:tblPr>
+      <w:tblGrid>
+        <w:gridCol w:w="3500"/>
+        <w:gridCol w:w="5460"/>
+      </w:tblGrid>
+      <w:tr>
+        <w:tc>
+          <w:tcPr>
+            <w:tcW w:type="dxa" w:w="3500"/>
+            <w:tcBorders>
+              <w:top w:val="single" w:color="CCCCCC" w:sz="1"/>
+              <w:left w:val="single" w:color="CCCCCC" w:sz="1"/>
+              <w:bottom w:val="single" w:color="CCCCCC" w:sz="1"/>
+              <w:right w:val="single" w:color="CCCCCC" w:sz="1"/>
+            </w:tcBorders>
+            <w:shd w:fill="D6E4F0" w:val="clear"/>
+            <w:tcMar>
+              <w:top w:type="dxa" w:w="80"/>
+              <w:left w:type="dxa" w:w="120"/>
+              <w:bottom w:type="dxa" w:w="80"/>
+              <w:right w:type="dxa" w:w="120"/>
+            </w:tcMar>
+          </w:tcPr>
+          <w:p>
+            <w:r>
+              <w:rPr>
+                <w:rFonts w:ascii="Arial" w:cs="Arial" w:eastAsia="Arial" w:hAnsi="Arial"/>
+                <w:b/>
+                <w:bCs/>
+                <w:color w:val="1F4E79"/>
+                <w:sz w:val="18"/>
+                <w:szCs w:val="18"/>
+              </w:rPr>
+              <w:t xml:space="preserve">Métrica</w:t>
+            </w:r>
+          </w:p>
+        </w:tc>
+        <w:tc>
+          <w:tcPr>
+            <w:tcW w:type="dxa" w:w="5460"/>
+            <w:tcBorders>
+              <w:top w:val="single" w:color="CCCCCC" w:sz="1"/>
+              <w:left w:val="single" w:color="CCCCCC" w:sz="1"/>
+              <w:bottom w:val="single" w:color="CCCCCC" w:sz="1"/>
+              <w:right w:val="single" w:color="CCCCCC" w:sz="1"/>
+            </w:tcBorders>
+            <w:shd w:fill="D6E4F0" w:val="clear"/>
+            <w:tcMar>
+              <w:top w:type="dxa" w:w="80"/>
+              <w:left w:type="dxa" w:w="120"/>
+              <w:bottom w:type="dxa" w:w="80"/>
+              <w:right w:type="dxa" w:w="120"/>
+            </w:tcMar>
+          </w:tcPr>
+          <w:p>
+            <w:r>
+              <w:rPr>
+                <w:rFonts w:ascii="Arial" w:cs="Arial" w:eastAsia="Arial" w:hAnsi="Arial"/>
+                <w:b/>
+                <w:bCs/>
+                <w:color w:val="1F4E79"/>
+                <w:sz w:val="18"/>
+                <w:szCs w:val="18"/>
+              </w:rPr>
+              <w:t xml:space="preserve">Valor</w:t>
+            </w:r>
+          </w:p>
+        </w:tc>
+      </w:tr>
+      <w:tr>
+        <w:tc>
+          <w:tcPr>
+            <w:tcW w:type="dxa" w:w="3500"/>
+            <w:tcBorders>
+              <w:top w:val="single" w:color="CCCCCC" w:sz="1"/>
+              <w:left w:val="single" w:color="CCCCCC" w:sz="1"/>
+              <w:bottom w:val="single" w:color="CCCCCC" w:sz="1"/>
+              <w:right w:val="single" w:color="CCCCCC" w:sz="1"/>
+            </w:tcBorders>
+            <w:tcMar>
+              <w:top w:type="dxa" w:w="80"/>
+              <w:left w:type="dxa" w:w="120"/>
+              <w:bottom w:type="dxa" w:w="80"/>
+              <w:right w:type="dxa" w:w="120"/>
+            </w:tcMar>
+          </w:tcPr>
+          <w:p>
+            <w:r>
+              <w:rPr>
+                <w:rFonts w:ascii="Arial" w:cs="Arial" w:eastAsia="Arial" w:hAnsi="Arial"/>
+                <w:color w:val="222222"/>
+                <w:sz w:val="18"/>
+                <w:szCs w:val="18"/>
+              </w:rPr>
+              <w:t xml:space="preserve">Total de grupos</w:t>
+            </w:r>
+          </w:p>
+        </w:tc>
+        <w:tc>
+          <w:tcPr>
+            <w:tcW w:type="dxa" w:w="5460"/>
+            <w:tcBorders>
+              <w:top w:val="single" w:color="CCCCCC" w:sz="1"/>
+              <w:left w:val="single" w:color="CCCCCC" w:sz="1"/>
+              <w:bottom w:val="single" w:color="CCCCCC" w:sz="1"/>
+              <w:right w:val="single" w:color="CCCCCC" w:sz="1"/>
+            </w:tcBorders>
+            <w:tcMar>
+              <w:top w:type="dxa" w:w="80"/>
+              <w:left w:type="dxa" w:w="120"/>
+              <w:bottom w:type="dxa" w:w="80"/>
+              <w:right w:type="dxa" w:w="120"/>
+            </w:tcMar>
+          </w:tcPr>
+          <w:p>
+            <w:r>
+              <w:rPr>
+                <w:rFonts w:ascii="Arial" w:cs="Arial" w:eastAsia="Arial" w:hAnsi="Arial"/>
+                <w:color w:val="222222"/>
+                <w:sz w:val="18"/>
+                <w:szCs w:val="18"/>
+              </w:rPr>
+              <w:t xml:space="preserve">31.080</w:t>
+            </w:r>
+          </w:p>
+        </w:tc>
+      </w:tr>
+      <w:tr>
+        <w:tc>
+          <w:tcPr>
+            <w:tcW w:type="dxa" w:w="3500"/>
+            <w:tcBorders>
+              <w:top w:val="single" w:color="CCCCCC" w:sz="1"/>
+              <w:left w:val="single" w:color="CCCCCC" w:sz="1"/>
+              <w:bottom w:val="single" w:color="CCCCCC" w:sz="1"/>
+              <w:right w:val="single" w:color="CCCCCC" w:sz="1"/>
+            </w:tcBorders>
+            <w:tcMar>
+              <w:top w:type="dxa" w:w="80"/>
+              <w:left w:type="dxa" w:w="120"/>
+              <w:bottom w:type="dxa" w:w="80"/>
+              <w:right w:type="dxa" w:w="120"/>
+            </w:tcMar>
+          </w:tcPr>
+          <w:p>
+            <w:r>
+              <w:rPr>
+                <w:rFonts w:ascii="Arial" w:cs="Arial" w:eastAsia="Arial" w:hAnsi="Arial"/>
+                <w:color w:val="222222"/>
+                <w:sz w:val="18"/>
+                <w:szCs w:val="18"/>
+              </w:rPr>
+              <w:t xml:space="preserve">Proposições cobertas</w:t>
+            </w:r>
+          </w:p>
+        </w:tc>
+        <w:tc>
+          <w:tcPr>
+            <w:tcW w:type="dxa" w:w="5460"/>
+            <w:tcBorders>
+              <w:top w:val="single" w:color="CCCCCC" w:sz="1"/>
+              <w:left w:val="single" w:color="CCCCCC" w:sz="1"/>
+              <w:bottom w:val="single" w:color="CCCCCC" w:sz="1"/>
+              <w:right w:val="single" w:color="CCCCCC" w:sz="1"/>
+            </w:tcBorders>
+            <w:tcMar>
+              <w:top w:type="dxa" w:w="80"/>
+              <w:left w:type="dxa" w:w="120"/>
+              <w:bottom w:type="dxa" w:w="80"/>
+              <w:right w:type="dxa" w:w="120"/>
+            </w:tcMar>
+          </w:tcPr>
+          <w:p>
+            <w:r>
+              <w:rPr>
+                <w:rFonts w:ascii="Arial" w:cs="Arial" w:eastAsia="Arial" w:hAnsi="Arial"/>
+                <w:color w:val="222222"/>
+                <w:sz w:val="18"/>
+                <w:szCs w:val="18"/>
+              </w:rPr>
+              <w:t xml:space="preserve">41.540</w:t>
+            </w:r>
+          </w:p>
+        </w:tc>
+      </w:tr>
+      <w:tr>
+        <w:tc>
+          <w:tcPr>
+            <w:tcW w:type="dxa" w:w="3500"/>
+            <w:tcBorders>
+              <w:top w:val="single" w:color="CCCCCC" w:sz="1"/>
+              <w:left w:val="single" w:color="CCCCCC" w:sz="1"/>
+              <w:bottom w:val="single" w:color="CCCCCC" w:sz="1"/>
+              <w:right w:val="single" w:color="CCCCCC" w:sz="1"/>
+            </w:tcBorders>
+            <w:tcMar>
+              <w:top w:type="dxa" w:w="80"/>
+              <w:left w:type="dxa" w:w="120"/>
+              <w:bottom w:type="dxa" w:w="80"/>
+              <w:right w:type="dxa" w:w="120"/>
+            </w:tcMar>
+          </w:tcPr>
+          <w:p>
+            <w:r>
+              <w:rPr>
+                <w:rFonts w:ascii="Arial" w:cs="Arial" w:eastAsia="Arial" w:hAnsi="Arial"/>
+                <w:color w:val="222222"/>
+                <w:sz w:val="18"/>
+                <w:szCs w:val="18"/>
+              </w:rPr>
+              <w:t xml:space="preserve">Período</w:t>
+            </w:r>
+          </w:p>
+        </w:tc>
+        <w:tc>
+          <w:tcPr>
+            <w:tcW w:type="dxa" w:w="5460"/>
+            <w:tcBorders>
+              <w:top w:val="single" w:color="CCCCCC" w:sz="1"/>
+              <w:left w:val="single" w:color="CCCCCC" w:sz="1"/>
+              <w:bottom w:val="single" w:color="CCCCCC" w:sz="1"/>
+              <w:right w:val="single" w:color="CCCCCC" w:sz="1"/>
+            </w:tcBorders>
+            <w:tcMar>
+              <w:top w:type="dxa" w:w="80"/>
+              <w:left w:type="dxa" w:w="120"/>
+              <w:bottom w:type="dxa" w:w="80"/>
+              <w:right w:type="dxa" w:w="120"/>
+            </w:tcMar>
+          </w:tcPr>
+          <w:p>
+            <w:r>
+              <w:rPr>
+                <w:rFonts w:ascii="Arial" w:cs="Arial" w:eastAsia="Arial" w:hAnsi="Arial"/>
+                <w:color w:val="222222"/>
+                <w:sz w:val="18"/>
+                <w:szCs w:val="18"/>
+              </w:rPr>
+              <w:t xml:space="preserve">2019-01-03 → 2026-04-14</w:t>
+            </w:r>
+          </w:p>
+        </w:tc>
+      </w:tr>
+      <w:tr>
+        <w:tc>
+          <w:tcPr>
+            <w:tcW w:type="dxa" w:w="3500"/>
+            <w:tcBorders>
+              <w:top w:val="single" w:color="CCCCCC" w:sz="1"/>
+              <w:left w:val="single" w:color="CCCCCC" w:sz="1"/>
+              <w:bottom w:val="single" w:color="CCCCCC" w:sz="1"/>
+              <w:right w:val="single" w:color="CCCCCC" w:sz="1"/>
+            </w:tcBorders>
+            <w:tcMar>
+              <w:top w:type="dxa" w:w="80"/>
+              <w:left w:type="dxa" w:w="120"/>
+              <w:bottom w:type="dxa" w:w="80"/>
+              <w:right w:type="dxa" w:w="120"/>
+            </w:tcMar>
+          </w:tcPr>
+          <w:p>
+            <w:r>
+              <w:rPr>
+                <w:rFonts w:ascii="Arial" w:cs="Arial" w:eastAsia="Arial" w:hAnsi="Arial"/>
+                <w:color w:val="222222"/>
+                <w:sz w:val="18"/>
+                <w:szCs w:val="18"/>
+              </w:rPr>
+              <w:t xml:space="preserve">Grupos com apensadas</w:t>
+            </w:r>
+          </w:p>
+        </w:tc>
+        <w:tc>
+          <w:tcPr>
+            <w:tcW w:type="dxa" w:w="5460"/>
+            <w:tcBorders>
+              <w:top w:val="single" w:color="CCCCCC" w:sz="1"/>
+              <w:left w:val="single" w:color="CCCCCC" w:sz="1"/>
+              <w:bottom w:val="single" w:color="CCCCCC" w:sz="1"/>
+              <w:right w:val="single" w:color="CCCCCC" w:sz="1"/>
+            </w:tcBorders>
+            <w:tcMar>
+              <w:top w:type="dxa" w:w="80"/>
+              <w:left w:type="dxa" w:w="120"/>
+              <w:bottom w:type="dxa" w:w="80"/>
+              <w:right w:type="dxa" w:w="120"/>
+            </w:tcMar>
+          </w:tcPr>
+          <w:p>
+            <w:r>
+              <w:rPr>
+                <w:rFonts w:ascii="Arial" w:cs="Arial" w:eastAsia="Arial" w:hAnsi="Arial"/>
+                <w:color w:val="222222"/>
+                <w:sz w:val="18"/>
+                <w:szCs w:val="18"/>
+              </w:rPr>
+              <w:t xml:space="preserve">4.095 (13,2%)</w:t>
+            </w:r>
+          </w:p>
+        </w:tc>
+      </w:tr>
+      <w:tr>
+        <w:tc>
+          <w:tcPr>
+            <w:tcW w:type="dxa" w:w="3500"/>
+            <w:tcBorders>
+              <w:top w:val="single" w:color="CCCCCC" w:sz="1"/>
+              <w:left w:val="single" w:color="CCCCCC" w:sz="1"/>
+              <w:bottom w:val="single" w:color="CCCCCC" w:sz="1"/>
+              <w:right w:val="single" w:color="CCCCCC" w:sz="1"/>
+            </w:tcBorders>
+            <w:tcMar>
+              <w:top w:type="dxa" w:w="80"/>
+              <w:left w:type="dxa" w:w="120"/>
+              <w:bottom w:type="dxa" w:w="80"/>
+              <w:right w:type="dxa" w:w="120"/>
+            </w:tcMar>
+          </w:tcPr>
+          <w:p>
+            <w:r>
+              <w:rPr>
+                <w:rFonts w:ascii="Arial" w:cs="Arial" w:eastAsia="Arial" w:hAnsi="Arial"/>
+                <w:color w:val="222222"/>
+                <w:sz w:val="18"/>
+                <w:szCs w:val="18"/>
+              </w:rPr>
+              <w:t xml:space="preserve">Máximo de apensadas</w:t>
+            </w:r>
+          </w:p>
+        </w:tc>
+        <w:tc>
+          <w:tcPr>
+            <w:tcW w:type="dxa" w:w="5460"/>
+            <w:tcBorders>
+              <w:top w:val="single" w:color="CCCCCC" w:sz="1"/>
+              <w:left w:val="single" w:color="CCCCCC" w:sz="1"/>
+              <w:bottom w:val="single" w:color="CCCCCC" w:sz="1"/>
+              <w:right w:val="single" w:color="CCCCCC" w:sz="1"/>
+            </w:tcBorders>
+            <w:tcMar>
+              <w:top w:type="dxa" w:w="80"/>
+              <w:left w:type="dxa" w:w="120"/>
+              <w:bottom w:type="dxa" w:w="80"/>
+              <w:right w:type="dxa" w:w="120"/>
+            </w:tcMar>
+          </w:tcPr>
+          <w:p>
+            <w:r>
+              <w:rPr>
+                <w:rFonts w:ascii="Arial" w:cs="Arial" w:eastAsia="Arial" w:hAnsi="Arial"/>
+                <w:color w:val="222222"/>
+                <w:sz w:val="18"/>
+                <w:szCs w:val="18"/>
+              </w:rPr>
+              <w:t xml:space="preserve">106 proposições num único grupo</w:t>
+            </w:r>
+          </w:p>
+        </w:tc>
+      </w:tr>
+      <w:tr>
+        <w:tc>
+          <w:tcPr>
+            <w:tcW w:type="dxa" w:w="3500"/>
+            <w:tcBorders>
+              <w:top w:val="single" w:color="CCCCCC" w:sz="1"/>
+              <w:left w:val="single" w:color="CCCCCC" w:sz="1"/>
+              <w:bottom w:val="single" w:color="CCCCCC" w:sz="1"/>
+              <w:right w:val="single" w:color="CCCCCC" w:sz="1"/>
+            </w:tcBorders>
+            <w:tcMar>
+              <w:top w:type="dxa" w:w="80"/>
+              <w:left w:type="dxa" w:w="120"/>
+              <w:bottom w:type="dxa" w:w="80"/>
+              <w:right w:type="dxa" w:w="120"/>
+            </w:tcMar>
+          </w:tcPr>
+          <w:p>
+            <w:r>
+              <w:rPr>
+                <w:rFonts w:ascii="Arial" w:cs="Arial" w:eastAsia="Arial" w:hAnsi="Arial"/>
+                <w:color w:val="222222"/>
+                <w:sz w:val="18"/>
+                <w:szCs w:val="18"/>
+              </w:rPr>
+              <w:t xml:space="preserve">Grupos sem tema</w:t>
+            </w:r>
+          </w:p>
+        </w:tc>
+        <w:tc>
+          <w:tcPr>
+            <w:tcW w:type="dxa" w:w="5460"/>
+            <w:tcBorders>
+              <w:top w:val="single" w:color="CCCCCC" w:sz="1"/>
+              <w:left w:val="single" w:color="CCCCCC" w:sz="1"/>
+              <w:bottom w:val="single" w:color="CCCCCC" w:sz="1"/>
+              <w:right w:val="single" w:color="CCCCCC" w:sz="1"/>
+            </w:tcBorders>
+            <w:tcMar>
+              <w:top w:type="dxa" w:w="80"/>
+              <w:left w:type="dxa" w:w="120"/>
+              <w:bottom w:type="dxa" w:w="80"/>
+              <w:right w:type="dxa" w:w="120"/>
+            </w:tcMar>
+          </w:tcPr>
+          <w:p>
+            <w:r>
+              <w:rPr>
+                <w:rFonts w:ascii="Arial" w:cs="Arial" w:eastAsia="Arial" w:hAnsi="Arial"/>
+                <w:color w:val="222222"/>
+                <w:sz w:val="18"/>
+                <w:szCs w:val="18"/>
+              </w:rPr>
+              <w:t xml:space="preserve">50 (0,2%)</w:t>
+            </w:r>
+          </w:p>
+        </w:tc>
+      </w:tr>
+      <w:tr>
+        <w:tc>
+          <w:tcPr>
+            <w:tcW w:type="dxa" w:w="3500"/>
+            <w:tcBorders>
+              <w:top w:val="single" w:color="CCCCCC" w:sz="1"/>
+              <w:left w:val="single" w:color="CCCCCC" w:sz="1"/>
+              <w:bottom w:val="single" w:color="CCCCCC" w:sz="1"/>
+              <w:right w:val="single" w:color="CCCCCC" w:sz="1"/>
+            </w:tcBorders>
+            <w:tcMar>
+              <w:top w:type="dxa" w:w="80"/>
+              <w:left w:type="dxa" w:w="120"/>
+              <w:bottom w:type="dxa" w:w="80"/>
+              <w:right w:type="dxa" w:w="120"/>
+            </w:tcMar>
+          </w:tcPr>
+          <w:p>
+            <w:r>
+              <w:rPr>
+                <w:rFonts w:ascii="Arial" w:cs="Arial" w:eastAsia="Arial" w:hAnsi="Arial"/>
+                <w:color w:val="222222"/>
+                <w:sz w:val="18"/>
+                <w:szCs w:val="18"/>
+              </w:rPr>
+              <w:t xml:space="preserve">Em tramitação</w:t>
+            </w:r>
+          </w:p>
+        </w:tc>
+        <w:tc>
+          <w:tcPr>
+            <w:tcW w:type="dxa" w:w="5460"/>
+            <w:tcBorders>
+              <w:top w:val="single" w:color="CCCCCC" w:sz="1"/>
+              <w:left w:val="single" w:color="CCCCCC" w:sz="1"/>
+              <w:bottom w:val="single" w:color="CCCCCC" w:sz="1"/>
+              <w:right w:val="single" w:color="CCCCCC" w:sz="1"/>
+            </w:tcBorders>
+            <w:tcMar>
+              <w:top w:type="dxa" w:w="80"/>
+              <w:left w:type="dxa" w:w="120"/>
+              <w:bottom w:type="dxa" w:w="80"/>
+              <w:right w:type="dxa" w:w="120"/>
+            </w:tcMar>
+          </w:tcPr>
+          <w:p>
+            <w:r>
+              <w:rPr>
+                <w:rFonts w:ascii="Arial" w:cs="Arial" w:eastAsia="Arial" w:hAnsi="Arial"/>
+                <w:color w:val="222222"/>
+                <w:sz w:val="18"/>
+                <w:szCs w:val="18"/>
+              </w:rPr>
+              <w:t xml:space="preserve">22.992 (74,0%)</w:t>
+            </w:r>
+          </w:p>
+        </w:tc>
+      </w:tr>
+      <w:tr>
+        <w:tc>
+          <w:tcPr>
+            <w:tcW w:type="dxa" w:w="3500"/>
+            <w:tcBorders>
+              <w:top w:val="single" w:color="CCCCCC" w:sz="1"/>
+              <w:left w:val="single" w:color="CCCCCC" w:sz="1"/>
+              <w:bottom w:val="single" w:color="CCCCCC" w:sz="1"/>
+              <w:right w:val="single" w:color="CCCCCC" w:sz="1"/>
+            </w:tcBorders>
+            <w:tcMar>
+              <w:top w:type="dxa" w:w="80"/>
+              <w:left w:type="dxa" w:w="120"/>
+              <w:bottom w:type="dxa" w:w="80"/>
+              <w:right w:type="dxa" w:w="120"/>
+            </w:tcMar>
+          </w:tcPr>
+          <w:p>
+            <w:r>
+              <w:rPr>
+                <w:rFonts w:ascii="Arial" w:cs="Arial" w:eastAsia="Arial" w:hAnsi="Arial"/>
+                <w:color w:val="222222"/>
+                <w:sz w:val="18"/>
+                <w:szCs w:val="18"/>
+              </w:rPr>
+              <w:t xml:space="preserve">Arquivada</w:t>
+            </w:r>
+          </w:p>
+        </w:tc>
+        <w:tc>
+          <w:tcPr>
+            <w:tcW w:type="dxa" w:w="5460"/>
+            <w:tcBorders>
+              <w:top w:val="single" w:color="CCCCCC" w:sz="1"/>
+              <w:left w:val="single" w:color="CCCCCC" w:sz="1"/>
+              <w:bottom w:val="single" w:color="CCCCCC" w:sz="1"/>
+              <w:right w:val="single" w:color="CCCCCC" w:sz="1"/>
+            </w:tcBorders>
+            <w:tcMar>
+              <w:top w:type="dxa" w:w="80"/>
+              <w:left w:type="dxa" w:w="120"/>
+              <w:bottom w:type="dxa" w:w="80"/>
+              <w:right w:type="dxa" w:w="120"/>
+            </w:tcMar>
+          </w:tcPr>
+          <w:p>
+            <w:r>
+              <w:rPr>
+                <w:rFonts w:ascii="Arial" w:cs="Arial" w:eastAsia="Arial" w:hAnsi="Arial"/>
+                <w:color w:val="222222"/>
+                <w:sz w:val="18"/>
+                <w:szCs w:val="18"/>
+              </w:rPr>
+              <w:t xml:space="preserve">6.514 (21,0%)</w:t>
+            </w:r>
+          </w:p>
+        </w:tc>
+      </w:tr>
+      <w:tr>
+        <w:tc>
+          <w:tcPr>
+            <w:tcW w:type="dxa" w:w="3500"/>
+            <w:tcBorders>
+              <w:top w:val="single" w:color="CCCCCC" w:sz="1"/>
+              <w:left w:val="single" w:color="CCCCCC" w:sz="1"/>
+              <w:bottom w:val="single" w:color="CCCCCC" w:sz="1"/>
+              <w:right w:val="single" w:color="CCCCCC" w:sz="1"/>
+            </w:tcBorders>
+            <w:tcMar>
+              <w:top w:type="dxa" w:w="80"/>
+              <w:left w:type="dxa" w:w="120"/>
+              <w:bottom w:type="dxa" w:w="80"/>
+              <w:right w:type="dxa" w:w="120"/>
+            </w:tcMar>
+          </w:tcPr>
+          <w:p>
+            <w:r>
+              <w:rPr>
+                <w:rFonts w:ascii="Arial" w:cs="Arial" w:eastAsia="Arial" w:hAnsi="Arial"/>
+                <w:color w:val="222222"/>
+                <w:sz w:val="18"/>
+                <w:szCs w:val="18"/>
+              </w:rPr>
+              <w:t xml:space="preserve">Transformada em norma</w:t>
+            </w:r>
+          </w:p>
+        </w:tc>
+        <w:tc>
+          <w:tcPr>
+            <w:tcW w:type="dxa" w:w="5460"/>
+            <w:tcBorders>
+              <w:top w:val="single" w:color="CCCCCC" w:sz="1"/>
+              <w:left w:val="single" w:color="CCCCCC" w:sz="1"/>
+              <w:bottom w:val="single" w:color="CCCCCC" w:sz="1"/>
+              <w:right w:val="single" w:color="CCCCCC" w:sz="1"/>
+            </w:tcBorders>
+            <w:tcMar>
+              <w:top w:type="dxa" w:w="80"/>
+              <w:left w:type="dxa" w:w="120"/>
+              <w:bottom w:type="dxa" w:w="80"/>
+              <w:right w:type="dxa" w:w="120"/>
+            </w:tcMar>
+          </w:tcPr>
+          <w:p>
+            <w:r>
+              <w:rPr>
+                <w:rFonts w:ascii="Arial" w:cs="Arial" w:eastAsia="Arial" w:hAnsi="Arial"/>
+                <w:color w:val="222222"/>
+                <w:sz w:val="18"/>
+                <w:szCs w:val="18"/>
+              </w:rPr>
+              <w:t xml:space="preserve">1.574 (5,1%)</w:t>
+            </w:r>
+          </w:p>
+        </w:tc>
+      </w:tr>
+    </w:tbl>
     <w:p>
       <w:pPr>
         <w:pBdr>
@@ -1382,7 +2010,7 @@
                 <w:sz w:val="18"/>
                 <w:szCs w:val="18"/>
               </w:rPr>
-              <w:t xml:space="preserve">Checkpoint por parquet parcial a cada 250 props.</w:t>
+              <w:t xml:space="preserve">Checkpoint parquet parcial a cada 250 props. ~50-60 min.</w:t>
             </w:r>
           </w:p>
         </w:tc>
@@ -1610,7 +2238,7 @@
                 <w:sz w:val="18"/>
                 <w:szCs w:val="18"/>
               </w:rPr>
-              <w:t xml:space="preserve">Unidade de atualização = grupo de apensadas.</w:t>
+              <w:t xml:space="preserve">Union-Find para cadeias de apensamento. ~1-2 min.</w:t>
             </w:r>
           </w:p>
         </w:tc>
@@ -1724,7 +2352,7 @@
                 <w:sz w:val="18"/>
                 <w:szCs w:val="18"/>
               </w:rPr>
-              <w:t xml:space="preserve">Aplica 3 classes. Salva versão final.</w:t>
+              <w:t xml:space="preserve">Seleciona colunas, normaliza tipos, gera resumo.</w:t>
             </w:r>
           </w:p>
         </w:tc>
@@ -1985,7 +2613,7 @@
           <w:sz w:val="20"/>
           <w:szCs w:val="20"/>
         </w:rPr>
-        <w:t xml:space="preserve">Lógica de precedência: Norma &gt; Tramitação &gt; Arquivada. Tudo que não se encaixa (NaN, indefinido, devolvida ao autor) vai para Arquivada.</w:t>
+        <w:t xml:space="preserve">Lógica de precedência aplicada no colapso: Norma &gt; Arquivada &gt; Em tramitação. Os campos ultimoStatus_* vêm da proposição que determinou a situação do grupo, não necessariamente do representante eleito.</w:t>
       </w:r>
     </w:p>
     <w:tbl>
@@ -2346,48 +2974,6 @@
     </w:p>
     <w:p>
       <w:pPr>
-        <w:spacing w:after="80" w:before="80"/>
-        <w:ind w:left="360"/>
-      </w:pPr>
-      <w:r>
-        <w:rPr>
-          <w:rFonts w:ascii="Arial" w:cs="Arial" w:eastAsia="Arial" w:hAnsi="Arial"/>
-          <w:i/>
-          <w:iCs/>
-          <w:color w:val="1F5C1F"/>
-          <w:sz w:val="18"/>
-          <w:szCs w:val="18"/>
-        </w:rPr>
-        <w:t xml:space="preserve">🔍 A Câmara atualizou retroativamente os temas da leg. 56. Em abril/2026, apenas ~50 proposições (de ~30k) estavam sem tema — muito menos do que o esperado. O classificador GPT passou a ser opcional.</w:t>
-      </w:r>
-    </w:p>
-    <w:p>
-      <w:pPr>
-        <w:spacing w:after="0" w:before="120"/>
-      </w:pPr>
-      <w:r>
-        <w:t xml:space="preserve"/>
-      </w:r>
-    </w:p>
-    <w:p>
-      <w:pPr>
-        <w:pStyle w:val="Heading2"/>
-        <w:spacing w:after="120" w:before="280"/>
-      </w:pPr>
-      <w:r>
-        <w:rPr>
-          <w:rFonts w:ascii="Arial" w:cs="Arial" w:eastAsia="Arial" w:hAnsi="Arial"/>
-          <w:b/>
-          <w:bCs/>
-          <w:color w:val="2E75B6"/>
-          <w:sz w:val="26"/>
-          <w:szCs w:val="26"/>
-        </w:rPr>
-        <w:t xml:space="preserve">4.4 Colapso de Apensadas</w:t>
-      </w:r>
-    </w:p>
-    <w:p>
-      <w:pPr>
         <w:pStyle w:val="ListParagraph"/>
         <w:numPr>
           <w:ilvl w:val="0"/>
@@ -2402,7 +2988,49 @@
           <w:sz w:val="20"/>
           <w:szCs w:val="20"/>
         </w:rPr>
-        <w:t xml:space="preserve">Proposições com uriPropPrincipal apontando para outra são agrupadas</w:t>
+        <w:t xml:space="preserve">Na fusão de apensadas: união dos conjuntos (sem duplicatas por nome de tema)</w:t>
+      </w:r>
+    </w:p>
+    <w:p>
+      <w:pPr>
+        <w:spacing w:after="80" w:before="80"/>
+        <w:ind w:left="360"/>
+      </w:pPr>
+      <w:r>
+        <w:rPr>
+          <w:rFonts w:ascii="Arial" w:cs="Arial" w:eastAsia="Arial" w:hAnsi="Arial"/>
+          <w:i/>
+          <w:iCs/>
+          <w:color w:val="1F5C1F"/>
+          <w:sz w:val="18"/>
+          <w:szCs w:val="18"/>
+        </w:rPr>
+        <w:t xml:space="preserve">🔍 A Câmara atualizou retroativamente os temas da leg. 56. Em abril/2026, apenas ~50 proposições (de ~30k) estavam sem tema. O classificador GPT passou a ser opcional.</w:t>
+      </w:r>
+    </w:p>
+    <w:p>
+      <w:pPr>
+        <w:spacing w:after="0" w:before="120"/>
+      </w:pPr>
+      <w:r>
+        <w:t xml:space="preserve"/>
+      </w:r>
+    </w:p>
+    <w:p>
+      <w:pPr>
+        <w:pStyle w:val="Heading2"/>
+        <w:spacing w:after="120" w:before="280"/>
+      </w:pPr>
+      <w:r>
+        <w:rPr>
+          <w:rFonts w:ascii="Arial" w:cs="Arial" w:eastAsia="Arial" w:hAnsi="Arial"/>
+          <w:b/>
+          <w:bCs/>
+          <w:color w:val="2E75B6"/>
+          <w:sz w:val="26"/>
+          <w:szCs w:val="26"/>
+        </w:rPr>
+        <w:t xml:space="preserve">4.4 Autores</w:t>
       </w:r>
     </w:p>
     <w:p>
@@ -2421,7 +3049,7 @@
           <w:sz w:val="20"/>
           <w:szCs w:val="20"/>
         </w:rPr>
-        <w:t xml:space="preserve">O representante do grupo é eleito por regras de prioridade (ver 4_colapsar.py)</w:t>
+        <w:t xml:space="preserve">Fonte: endpoint /proposicoes/{id}/autores da API da Câmara</w:t>
       </w:r>
     </w:p>
     <w:p>
@@ -2440,7 +3068,7 @@
           <w:sz w:val="20"/>
           <w:szCs w:val="20"/>
         </w:rPr>
-        <w:t xml:space="preserve">ids_agrupados guarda todos os IDs do grupo; id_representante guarda o eleito</w:t>
+        <w:t xml:space="preserve">Todos os tipos de autor são mantidos (deputados, comissões, executivo, senado)</w:t>
       </w:r>
     </w:p>
     <w:p>
@@ -2459,7 +3087,127 @@
           <w:sz w:val="20"/>
           <w:szCs w:val="20"/>
         </w:rPr>
-        <w:t xml:space="preserve">Campos conflitantes entre apensadas ficam registrados em colunas __valores_distintos</w:t>
+        <w:t xml:space="preserve">Na fusão de apensadas: união dos conjuntos (deduplicado por uriAutor, fallback por nomeAutor)</w:t>
+      </w:r>
+    </w:p>
+    <w:p>
+      <w:pPr>
+        <w:pStyle w:val="ListParagraph"/>
+        <w:numPr>
+          <w:ilvl w:val="0"/>
+          <w:numId w:val="2"/>
+        </w:numPr>
+        <w:spacing w:after="40" w:before="40"/>
+      </w:pPr>
+      <w:r>
+        <w:rPr>
+          <w:rFonts w:ascii="Arial" w:cs="Arial" w:eastAsia="Arial" w:hAnsi="Arial"/>
+          <w:color w:val="222222"/>
+          <w:sz w:val="20"/>
+          <w:szCs w:val="20"/>
+        </w:rPr>
+        <w:t xml:space="preserve">Coluna autores_deputados: subset filtrado por codTipo == 10000, para uso no dashboard</w:t>
+      </w:r>
+    </w:p>
+    <w:p>
+      <w:pPr>
+        <w:spacing w:after="0" w:before="120"/>
+      </w:pPr>
+      <w:r>
+        <w:t xml:space="preserve"/>
+      </w:r>
+    </w:p>
+    <w:p>
+      <w:pPr>
+        <w:pStyle w:val="Heading2"/>
+        <w:spacing w:after="120" w:before="280"/>
+      </w:pPr>
+      <w:r>
+        <w:rPr>
+          <w:rFonts w:ascii="Arial" w:cs="Arial" w:eastAsia="Arial" w:hAnsi="Arial"/>
+          <w:b/>
+          <w:bCs/>
+          <w:color w:val="2E75B6"/>
+          <w:sz w:val="26"/>
+          <w:szCs w:val="26"/>
+        </w:rPr>
+        <w:t xml:space="preserve">4.5 Colapso de Apensadas</w:t>
+      </w:r>
+    </w:p>
+    <w:p>
+      <w:pPr>
+        <w:pStyle w:val="ListParagraph"/>
+        <w:numPr>
+          <w:ilvl w:val="0"/>
+          <w:numId w:val="2"/>
+        </w:numPr>
+        <w:spacing w:after="40" w:before="40"/>
+      </w:pPr>
+      <w:r>
+        <w:rPr>
+          <w:rFonts w:ascii="Arial" w:cs="Arial" w:eastAsia="Arial" w:hAnsi="Arial"/>
+          <w:color w:val="222222"/>
+          <w:sz w:val="20"/>
+          <w:szCs w:val="20"/>
+        </w:rPr>
+        <w:t xml:space="preserve">Algoritmo Union-Find para lidar com cadeias de apensamento (A→B→C ficam no mesmo grupo)</w:t>
+      </w:r>
+    </w:p>
+    <w:p>
+      <w:pPr>
+        <w:pStyle w:val="ListParagraph"/>
+        <w:numPr>
+          <w:ilvl w:val="0"/>
+          <w:numId w:val="2"/>
+        </w:numPr>
+        <w:spacing w:after="40" w:before="40"/>
+      </w:pPr>
+      <w:r>
+        <w:rPr>
+          <w:rFonts w:ascii="Arial" w:cs="Arial" w:eastAsia="Arial" w:hAnsi="Arial"/>
+          <w:color w:val="222222"/>
+          <w:sz w:val="20"/>
+          <w:szCs w:val="20"/>
+        </w:rPr>
+        <w:t xml:space="preserve">Representante eleito por: proposição principal interna → mais antiga → menor ID</w:t>
+      </w:r>
+    </w:p>
+    <w:p>
+      <w:pPr>
+        <w:pStyle w:val="ListParagraph"/>
+        <w:numPr>
+          <w:ilvl w:val="0"/>
+          <w:numId w:val="2"/>
+        </w:numPr>
+        <w:spacing w:after="40" w:before="40"/>
+      </w:pPr>
+      <w:r>
+        <w:rPr>
+          <w:rFonts w:ascii="Arial" w:cs="Arial" w:eastAsia="Arial" w:hAnsi="Arial"/>
+          <w:color w:val="222222"/>
+          <w:sz w:val="20"/>
+          <w:szCs w:val="20"/>
+        </w:rPr>
+        <w:t xml:space="preserve">ids_agrupados guarda todos os IDs do grupo; id_representante guarda o eleito</w:t>
+      </w:r>
+    </w:p>
+    <w:p>
+      <w:pPr>
+        <w:pStyle w:val="ListParagraph"/>
+        <w:numPr>
+          <w:ilvl w:val="0"/>
+          <w:numId w:val="2"/>
+        </w:numPr>
+        <w:spacing w:after="40" w:before="40"/>
+      </w:pPr>
+      <w:r>
+        <w:rPr>
+          <w:rFonts w:ascii="Arial" w:cs="Arial" w:eastAsia="Arial" w:hAnsi="Arial"/>
+          <w:color w:val="222222"/>
+          <w:sz w:val="20"/>
+          <w:szCs w:val="20"/>
+        </w:rPr>
+        <w:t xml:space="preserve">Campos conflitantes entre apensadas registrados em colunas __valores_distintos</w:t>
       </w:r>
     </w:p>
     <w:p>
@@ -2481,10 +3229,7 @@
     </w:p>
     <w:p>
       <w:pPr>
-        <w:pBdr>
-          <w:bottom w:val="single" w:color="CCCCCC" w:sz="2" w:space="1"/>
-        </w:pBdr>
-        <w:spacing w:after="160" w:before="160"/>
+        <w:spacing w:after="0" w:before="120"/>
       </w:pPr>
       <w:r>
         <w:t xml:space="preserve"/>
@@ -2492,44 +3237,19 @@
     </w:p>
     <w:p>
       <w:pPr>
-        <w:pStyle w:val="Heading1"/>
-        <w:pBdr>
-          <w:bottom w:val="single" w:color="2E75B6" w:sz="6" w:space="1"/>
-        </w:pBdr>
-        <w:spacing w:after="160" w:before="400"/>
+        <w:pStyle w:val="Heading2"/>
+        <w:spacing w:after="120" w:before="280"/>
       </w:pPr>
       <w:r>
         <w:rPr>
           <w:rFonts w:ascii="Arial" w:cs="Arial" w:eastAsia="Arial" w:hAnsi="Arial"/>
           <w:b/>
           <w:bCs/>
-          <w:color w:val="1F4E79"/>
-          <w:sz w:val="32"/>
-          <w:szCs w:val="32"/>
-        </w:rPr>
-        <w:t xml:space="preserve">5. Decisões Metodológicas</w:t>
-      </w:r>
-    </w:p>
-    <w:p>
-      <w:pPr>
-        <w:spacing w:after="60" w:before="60"/>
-      </w:pPr>
-      <w:r>
-        <w:rPr>
-          <w:rFonts w:ascii="Arial" w:cs="Arial" w:eastAsia="Arial" w:hAnsi="Arial"/>
-          <w:color w:val="222222"/>
-          <w:sz w:val="20"/>
-          <w:szCs w:val="20"/>
-        </w:rPr>
-        <w:t xml:space="preserve">Registro das decisões tomadas durante a exploração dos dados. Importante para justificar escolhas no contexto jornalístico.</w:t>
-      </w:r>
-    </w:p>
-    <w:p>
-      <w:pPr>
-        <w:spacing w:after="0" w:before="120"/>
-      </w:pPr>
-      <w:r>
-        <w:t xml:space="preserve"/>
+          <w:color w:val="2E75B6"/>
+          <w:sz w:val="26"/>
+          <w:szCs w:val="26"/>
+        </w:rPr>
+        <w:t xml:space="preserve">4.6 Colunas da base final</w:t>
       </w:r>
     </w:p>
     <w:tbl>
@@ -2545,14 +3265,1384 @@
         </w:tblBorders>
       </w:tblPr>
       <w:tblGrid>
-        <w:gridCol w:w="2200"/>
-        <w:gridCol w:w="2200"/>
+        <w:gridCol w:w="2600"/>
+        <w:gridCol w:w="1200"/>
+        <w:gridCol w:w="5160"/>
+      </w:tblGrid>
+      <w:tr>
+        <w:tc>
+          <w:tcPr>
+            <w:tcW w:type="dxa" w:w="2600"/>
+            <w:tcBorders>
+              <w:top w:val="single" w:color="CCCCCC" w:sz="1"/>
+              <w:left w:val="single" w:color="CCCCCC" w:sz="1"/>
+              <w:bottom w:val="single" w:color="CCCCCC" w:sz="1"/>
+              <w:right w:val="single" w:color="CCCCCC" w:sz="1"/>
+            </w:tcBorders>
+            <w:shd w:fill="D6E4F0" w:val="clear"/>
+            <w:tcMar>
+              <w:top w:type="dxa" w:w="80"/>
+              <w:left w:type="dxa" w:w="120"/>
+              <w:bottom w:type="dxa" w:w="80"/>
+              <w:right w:type="dxa" w:w="120"/>
+            </w:tcMar>
+          </w:tcPr>
+          <w:p>
+            <w:r>
+              <w:rPr>
+                <w:rFonts w:ascii="Arial" w:cs="Arial" w:eastAsia="Arial" w:hAnsi="Arial"/>
+                <w:b/>
+                <w:bCs/>
+                <w:color w:val="1F4E79"/>
+                <w:sz w:val="18"/>
+                <w:szCs w:val="18"/>
+              </w:rPr>
+              <w:t xml:space="preserve">Coluna</w:t>
+            </w:r>
+          </w:p>
+        </w:tc>
+        <w:tc>
+          <w:tcPr>
+            <w:tcW w:type="dxa" w:w="1200"/>
+            <w:tcBorders>
+              <w:top w:val="single" w:color="CCCCCC" w:sz="1"/>
+              <w:left w:val="single" w:color="CCCCCC" w:sz="1"/>
+              <w:bottom w:val="single" w:color="CCCCCC" w:sz="1"/>
+              <w:right w:val="single" w:color="CCCCCC" w:sz="1"/>
+            </w:tcBorders>
+            <w:shd w:fill="D6E4F0" w:val="clear"/>
+            <w:tcMar>
+              <w:top w:type="dxa" w:w="80"/>
+              <w:left w:type="dxa" w:w="120"/>
+              <w:bottom w:type="dxa" w:w="80"/>
+              <w:right w:type="dxa" w:w="120"/>
+            </w:tcMar>
+          </w:tcPr>
+          <w:p>
+            <w:r>
+              <w:rPr>
+                <w:rFonts w:ascii="Arial" w:cs="Arial" w:eastAsia="Arial" w:hAnsi="Arial"/>
+                <w:b/>
+                <w:bCs/>
+                <w:color w:val="1F4E79"/>
+                <w:sz w:val="18"/>
+                <w:szCs w:val="18"/>
+              </w:rPr>
+              <w:t xml:space="preserve">Tipo</w:t>
+            </w:r>
+          </w:p>
+        </w:tc>
+        <w:tc>
+          <w:tcPr>
+            <w:tcW w:type="dxa" w:w="5160"/>
+            <w:tcBorders>
+              <w:top w:val="single" w:color="CCCCCC" w:sz="1"/>
+              <w:left w:val="single" w:color="CCCCCC" w:sz="1"/>
+              <w:bottom w:val="single" w:color="CCCCCC" w:sz="1"/>
+              <w:right w:val="single" w:color="CCCCCC" w:sz="1"/>
+            </w:tcBorders>
+            <w:shd w:fill="D6E4F0" w:val="clear"/>
+            <w:tcMar>
+              <w:top w:type="dxa" w:w="80"/>
+              <w:left w:type="dxa" w:w="120"/>
+              <w:bottom w:type="dxa" w:w="80"/>
+              <w:right w:type="dxa" w:w="120"/>
+            </w:tcMar>
+          </w:tcPr>
+          <w:p>
+            <w:r>
+              <w:rPr>
+                <w:rFonts w:ascii="Arial" w:cs="Arial" w:eastAsia="Arial" w:hAnsi="Arial"/>
+                <w:b/>
+                <w:bCs/>
+                <w:color w:val="1F4E79"/>
+                <w:sz w:val="18"/>
+                <w:szCs w:val="18"/>
+              </w:rPr>
+              <w:t xml:space="preserve">Descrição</w:t>
+            </w:r>
+          </w:p>
+        </w:tc>
+      </w:tr>
+      <w:tr>
+        <w:tc>
+          <w:tcPr>
+            <w:tcW w:type="dxa" w:w="2600"/>
+            <w:tcBorders>
+              <w:top w:val="single" w:color="CCCCCC" w:sz="1"/>
+              <w:left w:val="single" w:color="CCCCCC" w:sz="1"/>
+              <w:bottom w:val="single" w:color="CCCCCC" w:sz="1"/>
+              <w:right w:val="single" w:color="CCCCCC" w:sz="1"/>
+            </w:tcBorders>
+            <w:tcMar>
+              <w:top w:type="dxa" w:w="80"/>
+              <w:left w:type="dxa" w:w="120"/>
+              <w:bottom w:type="dxa" w:w="80"/>
+              <w:right w:type="dxa" w:w="120"/>
+            </w:tcMar>
+          </w:tcPr>
+          <w:p>
+            <w:r>
+              <w:rPr>
+                <w:rFonts w:ascii="Arial" w:cs="Arial" w:eastAsia="Arial" w:hAnsi="Arial"/>
+                <w:color w:val="222222"/>
+                <w:sz w:val="18"/>
+                <w:szCs w:val="18"/>
+              </w:rPr>
+              <w:t xml:space="preserve">group_id</w:t>
+            </w:r>
+          </w:p>
+        </w:tc>
+        <w:tc>
+          <w:tcPr>
+            <w:tcW w:type="dxa" w:w="1200"/>
+            <w:tcBorders>
+              <w:top w:val="single" w:color="CCCCCC" w:sz="1"/>
+              <w:left w:val="single" w:color="CCCCCC" w:sz="1"/>
+              <w:bottom w:val="single" w:color="CCCCCC" w:sz="1"/>
+              <w:right w:val="single" w:color="CCCCCC" w:sz="1"/>
+            </w:tcBorders>
+            <w:tcMar>
+              <w:top w:type="dxa" w:w="80"/>
+              <w:left w:type="dxa" w:w="120"/>
+              <w:bottom w:type="dxa" w:w="80"/>
+              <w:right w:type="dxa" w:w="120"/>
+            </w:tcMar>
+          </w:tcPr>
+          <w:p>
+            <w:r>
+              <w:rPr>
+                <w:rFonts w:ascii="Arial" w:cs="Arial" w:eastAsia="Arial" w:hAnsi="Arial"/>
+                <w:color w:val="222222"/>
+                <w:sz w:val="18"/>
+                <w:szCs w:val="18"/>
+              </w:rPr>
+              <w:t xml:space="preserve">Int64</w:t>
+            </w:r>
+          </w:p>
+        </w:tc>
+        <w:tc>
+          <w:tcPr>
+            <w:tcW w:type="dxa" w:w="5160"/>
+            <w:tcBorders>
+              <w:top w:val="single" w:color="CCCCCC" w:sz="1"/>
+              <w:left w:val="single" w:color="CCCCCC" w:sz="1"/>
+              <w:bottom w:val="single" w:color="CCCCCC" w:sz="1"/>
+              <w:right w:val="single" w:color="CCCCCC" w:sz="1"/>
+            </w:tcBorders>
+            <w:tcMar>
+              <w:top w:type="dxa" w:w="80"/>
+              <w:left w:type="dxa" w:w="120"/>
+              <w:bottom w:type="dxa" w:w="80"/>
+              <w:right w:type="dxa" w:w="120"/>
+            </w:tcMar>
+          </w:tcPr>
+          <w:p>
+            <w:r>
+              <w:rPr>
+                <w:rFonts w:ascii="Arial" w:cs="Arial" w:eastAsia="Arial" w:hAnsi="Arial"/>
+                <w:color w:val="222222"/>
+                <w:sz w:val="18"/>
+                <w:szCs w:val="18"/>
+              </w:rPr>
+              <w:t xml:space="preserve">ID do representante do grupo. Chave primária.</w:t>
+            </w:r>
+          </w:p>
+        </w:tc>
+      </w:tr>
+      <w:tr>
+        <w:tc>
+          <w:tcPr>
+            <w:tcW w:type="dxa" w:w="2600"/>
+            <w:tcBorders>
+              <w:top w:val="single" w:color="CCCCCC" w:sz="1"/>
+              <w:left w:val="single" w:color="CCCCCC" w:sz="1"/>
+              <w:bottom w:val="single" w:color="CCCCCC" w:sz="1"/>
+              <w:right w:val="single" w:color="CCCCCC" w:sz="1"/>
+            </w:tcBorders>
+            <w:tcMar>
+              <w:top w:type="dxa" w:w="80"/>
+              <w:left w:type="dxa" w:w="120"/>
+              <w:bottom w:type="dxa" w:w="80"/>
+              <w:right w:type="dxa" w:w="120"/>
+            </w:tcMar>
+          </w:tcPr>
+          <w:p>
+            <w:r>
+              <w:rPr>
+                <w:rFonts w:ascii="Arial" w:cs="Arial" w:eastAsia="Arial" w:hAnsi="Arial"/>
+                <w:color w:val="222222"/>
+                <w:sz w:val="18"/>
+                <w:szCs w:val="18"/>
+              </w:rPr>
+              <w:t xml:space="preserve">id_representante</w:t>
+            </w:r>
+          </w:p>
+        </w:tc>
+        <w:tc>
+          <w:tcPr>
+            <w:tcW w:type="dxa" w:w="1200"/>
+            <w:tcBorders>
+              <w:top w:val="single" w:color="CCCCCC" w:sz="1"/>
+              <w:left w:val="single" w:color="CCCCCC" w:sz="1"/>
+              <w:bottom w:val="single" w:color="CCCCCC" w:sz="1"/>
+              <w:right w:val="single" w:color="CCCCCC" w:sz="1"/>
+            </w:tcBorders>
+            <w:tcMar>
+              <w:top w:type="dxa" w:w="80"/>
+              <w:left w:type="dxa" w:w="120"/>
+              <w:bottom w:type="dxa" w:w="80"/>
+              <w:right w:type="dxa" w:w="120"/>
+            </w:tcMar>
+          </w:tcPr>
+          <w:p>
+            <w:r>
+              <w:rPr>
+                <w:rFonts w:ascii="Arial" w:cs="Arial" w:eastAsia="Arial" w:hAnsi="Arial"/>
+                <w:color w:val="222222"/>
+                <w:sz w:val="18"/>
+                <w:szCs w:val="18"/>
+              </w:rPr>
+              <w:t xml:space="preserve">Int64</w:t>
+            </w:r>
+          </w:p>
+        </w:tc>
+        <w:tc>
+          <w:tcPr>
+            <w:tcW w:type="dxa" w:w="5160"/>
+            <w:tcBorders>
+              <w:top w:val="single" w:color="CCCCCC" w:sz="1"/>
+              <w:left w:val="single" w:color="CCCCCC" w:sz="1"/>
+              <w:bottom w:val="single" w:color="CCCCCC" w:sz="1"/>
+              <w:right w:val="single" w:color="CCCCCC" w:sz="1"/>
+            </w:tcBorders>
+            <w:tcMar>
+              <w:top w:type="dxa" w:w="80"/>
+              <w:left w:type="dxa" w:w="120"/>
+              <w:bottom w:type="dxa" w:w="80"/>
+              <w:right w:type="dxa" w:w="120"/>
+            </w:tcMar>
+          </w:tcPr>
+          <w:p>
+            <w:r>
+              <w:rPr>
+                <w:rFonts w:ascii="Arial" w:cs="Arial" w:eastAsia="Arial" w:hAnsi="Arial"/>
+                <w:color w:val="222222"/>
+                <w:sz w:val="18"/>
+                <w:szCs w:val="18"/>
+              </w:rPr>
+              <w:t xml:space="preserve">ID da proposição eleita como representante.</w:t>
+            </w:r>
+          </w:p>
+        </w:tc>
+      </w:tr>
+      <w:tr>
+        <w:tc>
+          <w:tcPr>
+            <w:tcW w:type="dxa" w:w="2600"/>
+            <w:tcBorders>
+              <w:top w:val="single" w:color="CCCCCC" w:sz="1"/>
+              <w:left w:val="single" w:color="CCCCCC" w:sz="1"/>
+              <w:bottom w:val="single" w:color="CCCCCC" w:sz="1"/>
+              <w:right w:val="single" w:color="CCCCCC" w:sz="1"/>
+            </w:tcBorders>
+            <w:tcMar>
+              <w:top w:type="dxa" w:w="80"/>
+              <w:left w:type="dxa" w:w="120"/>
+              <w:bottom w:type="dxa" w:w="80"/>
+              <w:right w:type="dxa" w:w="120"/>
+            </w:tcMar>
+          </w:tcPr>
+          <w:p>
+            <w:r>
+              <w:rPr>
+                <w:rFonts w:ascii="Arial" w:cs="Arial" w:eastAsia="Arial" w:hAnsi="Arial"/>
+                <w:color w:val="222222"/>
+                <w:sz w:val="18"/>
+                <w:szCs w:val="18"/>
+              </w:rPr>
+              <w:t xml:space="preserve">ids_agrupados</w:t>
+            </w:r>
+          </w:p>
+        </w:tc>
+        <w:tc>
+          <w:tcPr>
+            <w:tcW w:type="dxa" w:w="1200"/>
+            <w:tcBorders>
+              <w:top w:val="single" w:color="CCCCCC" w:sz="1"/>
+              <w:left w:val="single" w:color="CCCCCC" w:sz="1"/>
+              <w:bottom w:val="single" w:color="CCCCCC" w:sz="1"/>
+              <w:right w:val="single" w:color="CCCCCC" w:sz="1"/>
+            </w:tcBorders>
+            <w:tcMar>
+              <w:top w:type="dxa" w:w="80"/>
+              <w:left w:type="dxa" w:w="120"/>
+              <w:bottom w:type="dxa" w:w="80"/>
+              <w:right w:type="dxa" w:w="120"/>
+            </w:tcMar>
+          </w:tcPr>
+          <w:p>
+            <w:r>
+              <w:rPr>
+                <w:rFonts w:ascii="Arial" w:cs="Arial" w:eastAsia="Arial" w:hAnsi="Arial"/>
+                <w:color w:val="222222"/>
+                <w:sz w:val="18"/>
+                <w:szCs w:val="18"/>
+              </w:rPr>
+              <w:t xml:space="preserve">JSON</w:t>
+            </w:r>
+          </w:p>
+        </w:tc>
+        <w:tc>
+          <w:tcPr>
+            <w:tcW w:type="dxa" w:w="5160"/>
+            <w:tcBorders>
+              <w:top w:val="single" w:color="CCCCCC" w:sz="1"/>
+              <w:left w:val="single" w:color="CCCCCC" w:sz="1"/>
+              <w:bottom w:val="single" w:color="CCCCCC" w:sz="1"/>
+              <w:right w:val="single" w:color="CCCCCC" w:sz="1"/>
+            </w:tcBorders>
+            <w:tcMar>
+              <w:top w:type="dxa" w:w="80"/>
+              <w:left w:type="dxa" w:w="120"/>
+              <w:bottom w:type="dxa" w:w="80"/>
+              <w:right w:type="dxa" w:w="120"/>
+            </w:tcMar>
+          </w:tcPr>
+          <w:p>
+            <w:r>
+              <w:rPr>
+                <w:rFonts w:ascii="Arial" w:cs="Arial" w:eastAsia="Arial" w:hAnsi="Arial"/>
+                <w:color w:val="222222"/>
+                <w:sz w:val="18"/>
+                <w:szCs w:val="18"/>
+              </w:rPr>
+              <w:t xml:space="preserve">Lista de todos os IDs do grupo (incluindo o representante).</w:t>
+            </w:r>
+          </w:p>
+        </w:tc>
+      </w:tr>
+      <w:tr>
+        <w:tc>
+          <w:tcPr>
+            <w:tcW w:type="dxa" w:w="2600"/>
+            <w:tcBorders>
+              <w:top w:val="single" w:color="CCCCCC" w:sz="1"/>
+              <w:left w:val="single" w:color="CCCCCC" w:sz="1"/>
+              <w:bottom w:val="single" w:color="CCCCCC" w:sz="1"/>
+              <w:right w:val="single" w:color="CCCCCC" w:sz="1"/>
+            </w:tcBorders>
+            <w:tcMar>
+              <w:top w:type="dxa" w:w="80"/>
+              <w:left w:type="dxa" w:w="120"/>
+              <w:bottom w:type="dxa" w:w="80"/>
+              <w:right w:type="dxa" w:w="120"/>
+            </w:tcMar>
+          </w:tcPr>
+          <w:p>
+            <w:r>
+              <w:rPr>
+                <w:rFonts w:ascii="Arial" w:cs="Arial" w:eastAsia="Arial" w:hAnsi="Arial"/>
+                <w:color w:val="222222"/>
+                <w:sz w:val="18"/>
+                <w:szCs w:val="18"/>
+              </w:rPr>
+              <w:t xml:space="preserve">n_ids_agrupados</w:t>
+            </w:r>
+          </w:p>
+        </w:tc>
+        <w:tc>
+          <w:tcPr>
+            <w:tcW w:type="dxa" w:w="1200"/>
+            <w:tcBorders>
+              <w:top w:val="single" w:color="CCCCCC" w:sz="1"/>
+              <w:left w:val="single" w:color="CCCCCC" w:sz="1"/>
+              <w:bottom w:val="single" w:color="CCCCCC" w:sz="1"/>
+              <w:right w:val="single" w:color="CCCCCC" w:sz="1"/>
+            </w:tcBorders>
+            <w:tcMar>
+              <w:top w:type="dxa" w:w="80"/>
+              <w:left w:type="dxa" w:w="120"/>
+              <w:bottom w:type="dxa" w:w="80"/>
+              <w:right w:type="dxa" w:w="120"/>
+            </w:tcMar>
+          </w:tcPr>
+          <w:p>
+            <w:r>
+              <w:rPr>
+                <w:rFonts w:ascii="Arial" w:cs="Arial" w:eastAsia="Arial" w:hAnsi="Arial"/>
+                <w:color w:val="222222"/>
+                <w:sz w:val="18"/>
+                <w:szCs w:val="18"/>
+              </w:rPr>
+              <w:t xml:space="preserve">Int64</w:t>
+            </w:r>
+          </w:p>
+        </w:tc>
+        <w:tc>
+          <w:tcPr>
+            <w:tcW w:type="dxa" w:w="5160"/>
+            <w:tcBorders>
+              <w:top w:val="single" w:color="CCCCCC" w:sz="1"/>
+              <w:left w:val="single" w:color="CCCCCC" w:sz="1"/>
+              <w:bottom w:val="single" w:color="CCCCCC" w:sz="1"/>
+              <w:right w:val="single" w:color="CCCCCC" w:sz="1"/>
+            </w:tcBorders>
+            <w:tcMar>
+              <w:top w:type="dxa" w:w="80"/>
+              <w:left w:type="dxa" w:w="120"/>
+              <w:bottom w:type="dxa" w:w="80"/>
+              <w:right w:type="dxa" w:w="120"/>
+            </w:tcMar>
+          </w:tcPr>
+          <w:p>
+            <w:r>
+              <w:rPr>
+                <w:rFonts w:ascii="Arial" w:cs="Arial" w:eastAsia="Arial" w:hAnsi="Arial"/>
+                <w:color w:val="222222"/>
+                <w:sz w:val="18"/>
+                <w:szCs w:val="18"/>
+              </w:rPr>
+              <w:t xml:space="preserve">Quantidade de proposições no grupo.</w:t>
+            </w:r>
+          </w:p>
+        </w:tc>
+      </w:tr>
+      <w:tr>
+        <w:tc>
+          <w:tcPr>
+            <w:tcW w:type="dxa" w:w="2600"/>
+            <w:tcBorders>
+              <w:top w:val="single" w:color="CCCCCC" w:sz="1"/>
+              <w:left w:val="single" w:color="CCCCCC" w:sz="1"/>
+              <w:bottom w:val="single" w:color="CCCCCC" w:sz="1"/>
+              <w:right w:val="single" w:color="CCCCCC" w:sz="1"/>
+            </w:tcBorders>
+            <w:tcMar>
+              <w:top w:type="dxa" w:w="80"/>
+              <w:left w:type="dxa" w:w="120"/>
+              <w:bottom w:type="dxa" w:w="80"/>
+              <w:right w:type="dxa" w:w="120"/>
+            </w:tcMar>
+          </w:tcPr>
+          <w:p>
+            <w:r>
+              <w:rPr>
+                <w:rFonts w:ascii="Arial" w:cs="Arial" w:eastAsia="Arial" w:hAnsi="Arial"/>
+                <w:color w:val="222222"/>
+                <w:sz w:val="18"/>
+                <w:szCs w:val="18"/>
+              </w:rPr>
+              <w:t xml:space="preserve">siglaTipo</w:t>
+            </w:r>
+          </w:p>
+        </w:tc>
+        <w:tc>
+          <w:tcPr>
+            <w:tcW w:type="dxa" w:w="1200"/>
+            <w:tcBorders>
+              <w:top w:val="single" w:color="CCCCCC" w:sz="1"/>
+              <w:left w:val="single" w:color="CCCCCC" w:sz="1"/>
+              <w:bottom w:val="single" w:color="CCCCCC" w:sz="1"/>
+              <w:right w:val="single" w:color="CCCCCC" w:sz="1"/>
+            </w:tcBorders>
+            <w:tcMar>
+              <w:top w:type="dxa" w:w="80"/>
+              <w:left w:type="dxa" w:w="120"/>
+              <w:bottom w:type="dxa" w:w="80"/>
+              <w:right w:type="dxa" w:w="120"/>
+            </w:tcMar>
+          </w:tcPr>
+          <w:p>
+            <w:r>
+              <w:rPr>
+                <w:rFonts w:ascii="Arial" w:cs="Arial" w:eastAsia="Arial" w:hAnsi="Arial"/>
+                <w:color w:val="222222"/>
+                <w:sz w:val="18"/>
+                <w:szCs w:val="18"/>
+              </w:rPr>
+              <w:t xml:space="preserve">string</w:t>
+            </w:r>
+          </w:p>
+        </w:tc>
+        <w:tc>
+          <w:tcPr>
+            <w:tcW w:type="dxa" w:w="5160"/>
+            <w:tcBorders>
+              <w:top w:val="single" w:color="CCCCCC" w:sz="1"/>
+              <w:left w:val="single" w:color="CCCCCC" w:sz="1"/>
+              <w:bottom w:val="single" w:color="CCCCCC" w:sz="1"/>
+              <w:right w:val="single" w:color="CCCCCC" w:sz="1"/>
+            </w:tcBorders>
+            <w:tcMar>
+              <w:top w:type="dxa" w:w="80"/>
+              <w:left w:type="dxa" w:w="120"/>
+              <w:bottom w:type="dxa" w:w="80"/>
+              <w:right w:type="dxa" w:w="120"/>
+            </w:tcMar>
+          </w:tcPr>
+          <w:p>
+            <w:r>
+              <w:rPr>
+                <w:rFonts w:ascii="Arial" w:cs="Arial" w:eastAsia="Arial" w:hAnsi="Arial"/>
+                <w:color w:val="222222"/>
+                <w:sz w:val="18"/>
+                <w:szCs w:val="18"/>
+              </w:rPr>
+              <w:t xml:space="preserve">Tipo da proposição (PL, PEC, PLP, PDL, PDC).</w:t>
+            </w:r>
+          </w:p>
+        </w:tc>
+      </w:tr>
+      <w:tr>
+        <w:tc>
+          <w:tcPr>
+            <w:tcW w:type="dxa" w:w="2600"/>
+            <w:tcBorders>
+              <w:top w:val="single" w:color="CCCCCC" w:sz="1"/>
+              <w:left w:val="single" w:color="CCCCCC" w:sz="1"/>
+              <w:bottom w:val="single" w:color="CCCCCC" w:sz="1"/>
+              <w:right w:val="single" w:color="CCCCCC" w:sz="1"/>
+            </w:tcBorders>
+            <w:tcMar>
+              <w:top w:type="dxa" w:w="80"/>
+              <w:left w:type="dxa" w:w="120"/>
+              <w:bottom w:type="dxa" w:w="80"/>
+              <w:right w:type="dxa" w:w="120"/>
+            </w:tcMar>
+          </w:tcPr>
+          <w:p>
+            <w:r>
+              <w:rPr>
+                <w:rFonts w:ascii="Arial" w:cs="Arial" w:eastAsia="Arial" w:hAnsi="Arial"/>
+                <w:color w:val="222222"/>
+                <w:sz w:val="18"/>
+                <w:szCs w:val="18"/>
+              </w:rPr>
+              <w:t xml:space="preserve">numero / ano</w:t>
+            </w:r>
+          </w:p>
+        </w:tc>
+        <w:tc>
+          <w:tcPr>
+            <w:tcW w:type="dxa" w:w="1200"/>
+            <w:tcBorders>
+              <w:top w:val="single" w:color="CCCCCC" w:sz="1"/>
+              <w:left w:val="single" w:color="CCCCCC" w:sz="1"/>
+              <w:bottom w:val="single" w:color="CCCCCC" w:sz="1"/>
+              <w:right w:val="single" w:color="CCCCCC" w:sz="1"/>
+            </w:tcBorders>
+            <w:tcMar>
+              <w:top w:type="dxa" w:w="80"/>
+              <w:left w:type="dxa" w:w="120"/>
+              <w:bottom w:type="dxa" w:w="80"/>
+              <w:right w:type="dxa" w:w="120"/>
+            </w:tcMar>
+          </w:tcPr>
+          <w:p>
+            <w:r>
+              <w:rPr>
+                <w:rFonts w:ascii="Arial" w:cs="Arial" w:eastAsia="Arial" w:hAnsi="Arial"/>
+                <w:color w:val="222222"/>
+                <w:sz w:val="18"/>
+                <w:szCs w:val="18"/>
+              </w:rPr>
+              <w:t xml:space="preserve">Int64</w:t>
+            </w:r>
+          </w:p>
+        </w:tc>
+        <w:tc>
+          <w:tcPr>
+            <w:tcW w:type="dxa" w:w="5160"/>
+            <w:tcBorders>
+              <w:top w:val="single" w:color="CCCCCC" w:sz="1"/>
+              <w:left w:val="single" w:color="CCCCCC" w:sz="1"/>
+              <w:bottom w:val="single" w:color="CCCCCC" w:sz="1"/>
+              <w:right w:val="single" w:color="CCCCCC" w:sz="1"/>
+            </w:tcBorders>
+            <w:tcMar>
+              <w:top w:type="dxa" w:w="80"/>
+              <w:left w:type="dxa" w:w="120"/>
+              <w:bottom w:type="dxa" w:w="80"/>
+              <w:right w:type="dxa" w:w="120"/>
+            </w:tcMar>
+          </w:tcPr>
+          <w:p>
+            <w:r>
+              <w:rPr>
+                <w:rFonts w:ascii="Arial" w:cs="Arial" w:eastAsia="Arial" w:hAnsi="Arial"/>
+                <w:color w:val="222222"/>
+                <w:sz w:val="18"/>
+                <w:szCs w:val="18"/>
+              </w:rPr>
+              <w:t xml:space="preserve">Número e ano da proposição representante.</w:t>
+            </w:r>
+          </w:p>
+        </w:tc>
+      </w:tr>
+      <w:tr>
+        <w:tc>
+          <w:tcPr>
+            <w:tcW w:type="dxa" w:w="2600"/>
+            <w:tcBorders>
+              <w:top w:val="single" w:color="CCCCCC" w:sz="1"/>
+              <w:left w:val="single" w:color="CCCCCC" w:sz="1"/>
+              <w:bottom w:val="single" w:color="CCCCCC" w:sz="1"/>
+              <w:right w:val="single" w:color="CCCCCC" w:sz="1"/>
+            </w:tcBorders>
+            <w:tcMar>
+              <w:top w:type="dxa" w:w="80"/>
+              <w:left w:type="dxa" w:w="120"/>
+              <w:bottom w:type="dxa" w:w="80"/>
+              <w:right w:type="dxa" w:w="120"/>
+            </w:tcMar>
+          </w:tcPr>
+          <w:p>
+            <w:r>
+              <w:rPr>
+                <w:rFonts w:ascii="Arial" w:cs="Arial" w:eastAsia="Arial" w:hAnsi="Arial"/>
+                <w:color w:val="222222"/>
+                <w:sz w:val="18"/>
+                <w:szCs w:val="18"/>
+              </w:rPr>
+              <w:t xml:space="preserve">dataApresentacao</w:t>
+            </w:r>
+          </w:p>
+        </w:tc>
+        <w:tc>
+          <w:tcPr>
+            <w:tcW w:type="dxa" w:w="1200"/>
+            <w:tcBorders>
+              <w:top w:val="single" w:color="CCCCCC" w:sz="1"/>
+              <w:left w:val="single" w:color="CCCCCC" w:sz="1"/>
+              <w:bottom w:val="single" w:color="CCCCCC" w:sz="1"/>
+              <w:right w:val="single" w:color="CCCCCC" w:sz="1"/>
+            </w:tcBorders>
+            <w:tcMar>
+              <w:top w:type="dxa" w:w="80"/>
+              <w:left w:type="dxa" w:w="120"/>
+              <w:bottom w:type="dxa" w:w="80"/>
+              <w:right w:type="dxa" w:w="120"/>
+            </w:tcMar>
+          </w:tcPr>
+          <w:p>
+            <w:r>
+              <w:rPr>
+                <w:rFonts w:ascii="Arial" w:cs="Arial" w:eastAsia="Arial" w:hAnsi="Arial"/>
+                <w:color w:val="222222"/>
+                <w:sz w:val="18"/>
+                <w:szCs w:val="18"/>
+              </w:rPr>
+              <w:t xml:space="preserve">datetime</w:t>
+            </w:r>
+          </w:p>
+        </w:tc>
+        <w:tc>
+          <w:tcPr>
+            <w:tcW w:type="dxa" w:w="5160"/>
+            <w:tcBorders>
+              <w:top w:val="single" w:color="CCCCCC" w:sz="1"/>
+              <w:left w:val="single" w:color="CCCCCC" w:sz="1"/>
+              <w:bottom w:val="single" w:color="CCCCCC" w:sz="1"/>
+              <w:right w:val="single" w:color="CCCCCC" w:sz="1"/>
+            </w:tcBorders>
+            <w:tcMar>
+              <w:top w:type="dxa" w:w="80"/>
+              <w:left w:type="dxa" w:w="120"/>
+              <w:bottom w:type="dxa" w:w="80"/>
+              <w:right w:type="dxa" w:w="120"/>
+            </w:tcMar>
+          </w:tcPr>
+          <w:p>
+            <w:r>
+              <w:rPr>
+                <w:rFonts w:ascii="Arial" w:cs="Arial" w:eastAsia="Arial" w:hAnsi="Arial"/>
+                <w:color w:val="222222"/>
+                <w:sz w:val="18"/>
+                <w:szCs w:val="18"/>
+              </w:rPr>
+              <w:t xml:space="preserve">Data de apresentação da proposição representante.</w:t>
+            </w:r>
+          </w:p>
+        </w:tc>
+      </w:tr>
+      <w:tr>
+        <w:tc>
+          <w:tcPr>
+            <w:tcW w:type="dxa" w:w="2600"/>
+            <w:tcBorders>
+              <w:top w:val="single" w:color="CCCCCC" w:sz="1"/>
+              <w:left w:val="single" w:color="CCCCCC" w:sz="1"/>
+              <w:bottom w:val="single" w:color="CCCCCC" w:sz="1"/>
+              <w:right w:val="single" w:color="CCCCCC" w:sz="1"/>
+            </w:tcBorders>
+            <w:tcMar>
+              <w:top w:type="dxa" w:w="80"/>
+              <w:left w:type="dxa" w:w="120"/>
+              <w:bottom w:type="dxa" w:w="80"/>
+              <w:right w:type="dxa" w:w="120"/>
+            </w:tcMar>
+          </w:tcPr>
+          <w:p>
+            <w:r>
+              <w:rPr>
+                <w:rFonts w:ascii="Arial" w:cs="Arial" w:eastAsia="Arial" w:hAnsi="Arial"/>
+                <w:color w:val="222222"/>
+                <w:sz w:val="18"/>
+                <w:szCs w:val="18"/>
+              </w:rPr>
+              <w:t xml:space="preserve">ementa / keywords</w:t>
+            </w:r>
+          </w:p>
+        </w:tc>
+        <w:tc>
+          <w:tcPr>
+            <w:tcW w:type="dxa" w:w="1200"/>
+            <w:tcBorders>
+              <w:top w:val="single" w:color="CCCCCC" w:sz="1"/>
+              <w:left w:val="single" w:color="CCCCCC" w:sz="1"/>
+              <w:bottom w:val="single" w:color="CCCCCC" w:sz="1"/>
+              <w:right w:val="single" w:color="CCCCCC" w:sz="1"/>
+            </w:tcBorders>
+            <w:tcMar>
+              <w:top w:type="dxa" w:w="80"/>
+              <w:left w:type="dxa" w:w="120"/>
+              <w:bottom w:type="dxa" w:w="80"/>
+              <w:right w:type="dxa" w:w="120"/>
+            </w:tcMar>
+          </w:tcPr>
+          <w:p>
+            <w:r>
+              <w:rPr>
+                <w:rFonts w:ascii="Arial" w:cs="Arial" w:eastAsia="Arial" w:hAnsi="Arial"/>
+                <w:color w:val="222222"/>
+                <w:sz w:val="18"/>
+                <w:szCs w:val="18"/>
+              </w:rPr>
+              <w:t xml:space="preserve">string</w:t>
+            </w:r>
+          </w:p>
+        </w:tc>
+        <w:tc>
+          <w:tcPr>
+            <w:tcW w:type="dxa" w:w="5160"/>
+            <w:tcBorders>
+              <w:top w:val="single" w:color="CCCCCC" w:sz="1"/>
+              <w:left w:val="single" w:color="CCCCCC" w:sz="1"/>
+              <w:bottom w:val="single" w:color="CCCCCC" w:sz="1"/>
+              <w:right w:val="single" w:color="CCCCCC" w:sz="1"/>
+            </w:tcBorders>
+            <w:tcMar>
+              <w:top w:type="dxa" w:w="80"/>
+              <w:left w:type="dxa" w:w="120"/>
+              <w:bottom w:type="dxa" w:w="80"/>
+              <w:right w:type="dxa" w:w="120"/>
+            </w:tcMar>
+          </w:tcPr>
+          <w:p>
+            <w:r>
+              <w:rPr>
+                <w:rFonts w:ascii="Arial" w:cs="Arial" w:eastAsia="Arial" w:hAnsi="Arial"/>
+                <w:color w:val="222222"/>
+                <w:sz w:val="18"/>
+                <w:szCs w:val="18"/>
+              </w:rPr>
+              <w:t xml:space="preserve">Ementa e palavras-chave.</w:t>
+            </w:r>
+          </w:p>
+        </w:tc>
+      </w:tr>
+      <w:tr>
+        <w:tc>
+          <w:tcPr>
+            <w:tcW w:type="dxa" w:w="2600"/>
+            <w:tcBorders>
+              <w:top w:val="single" w:color="CCCCCC" w:sz="1"/>
+              <w:left w:val="single" w:color="CCCCCC" w:sz="1"/>
+              <w:bottom w:val="single" w:color="CCCCCC" w:sz="1"/>
+              <w:right w:val="single" w:color="CCCCCC" w:sz="1"/>
+            </w:tcBorders>
+            <w:tcMar>
+              <w:top w:type="dxa" w:w="80"/>
+              <w:left w:type="dxa" w:w="120"/>
+              <w:bottom w:type="dxa" w:w="80"/>
+              <w:right w:type="dxa" w:w="120"/>
+            </w:tcMar>
+          </w:tcPr>
+          <w:p>
+            <w:r>
+              <w:rPr>
+                <w:rFonts w:ascii="Arial" w:cs="Arial" w:eastAsia="Arial" w:hAnsi="Arial"/>
+                <w:color w:val="222222"/>
+                <w:sz w:val="18"/>
+                <w:szCs w:val="18"/>
+              </w:rPr>
+              <w:t xml:space="preserve">situacao_simplificada</w:t>
+            </w:r>
+          </w:p>
+        </w:tc>
+        <w:tc>
+          <w:tcPr>
+            <w:tcW w:type="dxa" w:w="1200"/>
+            <w:tcBorders>
+              <w:top w:val="single" w:color="CCCCCC" w:sz="1"/>
+              <w:left w:val="single" w:color="CCCCCC" w:sz="1"/>
+              <w:bottom w:val="single" w:color="CCCCCC" w:sz="1"/>
+              <w:right w:val="single" w:color="CCCCCC" w:sz="1"/>
+            </w:tcBorders>
+            <w:tcMar>
+              <w:top w:type="dxa" w:w="80"/>
+              <w:left w:type="dxa" w:w="120"/>
+              <w:bottom w:type="dxa" w:w="80"/>
+              <w:right w:type="dxa" w:w="120"/>
+            </w:tcMar>
+          </w:tcPr>
+          <w:p>
+            <w:r>
+              <w:rPr>
+                <w:rFonts w:ascii="Arial" w:cs="Arial" w:eastAsia="Arial" w:hAnsi="Arial"/>
+                <w:color w:val="222222"/>
+                <w:sz w:val="18"/>
+                <w:szCs w:val="18"/>
+              </w:rPr>
+              <w:t xml:space="preserve">string</w:t>
+            </w:r>
+          </w:p>
+        </w:tc>
+        <w:tc>
+          <w:tcPr>
+            <w:tcW w:type="dxa" w:w="5160"/>
+            <w:tcBorders>
+              <w:top w:val="single" w:color="CCCCCC" w:sz="1"/>
+              <w:left w:val="single" w:color="CCCCCC" w:sz="1"/>
+              <w:bottom w:val="single" w:color="CCCCCC" w:sz="1"/>
+              <w:right w:val="single" w:color="CCCCCC" w:sz="1"/>
+            </w:tcBorders>
+            <w:tcMar>
+              <w:top w:type="dxa" w:w="80"/>
+              <w:left w:type="dxa" w:w="120"/>
+              <w:bottom w:type="dxa" w:w="80"/>
+              <w:right w:type="dxa" w:w="120"/>
+            </w:tcMar>
+          </w:tcPr>
+          <w:p>
+            <w:r>
+              <w:rPr>
+                <w:rFonts w:ascii="Arial" w:cs="Arial" w:eastAsia="Arial" w:hAnsi="Arial"/>
+                <w:color w:val="222222"/>
+                <w:sz w:val="18"/>
+                <w:szCs w:val="18"/>
+              </w:rPr>
+              <w:t xml:space="preserve">Uma das 3 classes de situação.</w:t>
+            </w:r>
+          </w:p>
+        </w:tc>
+      </w:tr>
+      <w:tr>
+        <w:tc>
+          <w:tcPr>
+            <w:tcW w:type="dxa" w:w="2600"/>
+            <w:tcBorders>
+              <w:top w:val="single" w:color="CCCCCC" w:sz="1"/>
+              <w:left w:val="single" w:color="CCCCCC" w:sz="1"/>
+              <w:bottom w:val="single" w:color="CCCCCC" w:sz="1"/>
+              <w:right w:val="single" w:color="CCCCCC" w:sz="1"/>
+            </w:tcBorders>
+            <w:tcMar>
+              <w:top w:type="dxa" w:w="80"/>
+              <w:left w:type="dxa" w:w="120"/>
+              <w:bottom w:type="dxa" w:w="80"/>
+              <w:right w:type="dxa" w:w="120"/>
+            </w:tcMar>
+          </w:tcPr>
+          <w:p>
+            <w:r>
+              <w:rPr>
+                <w:rFonts w:ascii="Arial" w:cs="Arial" w:eastAsia="Arial" w:hAnsi="Arial"/>
+                <w:color w:val="222222"/>
+                <w:sz w:val="18"/>
+                <w:szCs w:val="18"/>
+              </w:rPr>
+              <w:t xml:space="preserve">ultimoStatus_*</w:t>
+            </w:r>
+          </w:p>
+        </w:tc>
+        <w:tc>
+          <w:tcPr>
+            <w:tcW w:type="dxa" w:w="1200"/>
+            <w:tcBorders>
+              <w:top w:val="single" w:color="CCCCCC" w:sz="1"/>
+              <w:left w:val="single" w:color="CCCCCC" w:sz="1"/>
+              <w:bottom w:val="single" w:color="CCCCCC" w:sz="1"/>
+              <w:right w:val="single" w:color="CCCCCC" w:sz="1"/>
+            </w:tcBorders>
+            <w:tcMar>
+              <w:top w:type="dxa" w:w="80"/>
+              <w:left w:type="dxa" w:w="120"/>
+              <w:bottom w:type="dxa" w:w="80"/>
+              <w:right w:type="dxa" w:w="120"/>
+            </w:tcMar>
+          </w:tcPr>
+          <w:p>
+            <w:r>
+              <w:rPr>
+                <w:rFonts w:ascii="Arial" w:cs="Arial" w:eastAsia="Arial" w:hAnsi="Arial"/>
+                <w:color w:val="222222"/>
+                <w:sz w:val="18"/>
+                <w:szCs w:val="18"/>
+              </w:rPr>
+              <w:t xml:space="preserve">mixed</w:t>
+            </w:r>
+          </w:p>
+        </w:tc>
+        <w:tc>
+          <w:tcPr>
+            <w:tcW w:type="dxa" w:w="5160"/>
+            <w:tcBorders>
+              <w:top w:val="single" w:color="CCCCCC" w:sz="1"/>
+              <w:left w:val="single" w:color="CCCCCC" w:sz="1"/>
+              <w:bottom w:val="single" w:color="CCCCCC" w:sz="1"/>
+              <w:right w:val="single" w:color="CCCCCC" w:sz="1"/>
+            </w:tcBorders>
+            <w:tcMar>
+              <w:top w:type="dxa" w:w="80"/>
+              <w:left w:type="dxa" w:w="120"/>
+              <w:bottom w:type="dxa" w:w="80"/>
+              <w:right w:type="dxa" w:w="120"/>
+            </w:tcMar>
+          </w:tcPr>
+          <w:p>
+            <w:r>
+              <w:rPr>
+                <w:rFonts w:ascii="Arial" w:cs="Arial" w:eastAsia="Arial" w:hAnsi="Arial"/>
+                <w:color w:val="222222"/>
+                <w:sz w:val="18"/>
+                <w:szCs w:val="18"/>
+              </w:rPr>
+              <w:t xml:space="preserve">Campos do último status — vêm da proposição que determinou a situação.</w:t>
+            </w:r>
+          </w:p>
+        </w:tc>
+      </w:tr>
+      <w:tr>
+        <w:tc>
+          <w:tcPr>
+            <w:tcW w:type="dxa" w:w="2600"/>
+            <w:tcBorders>
+              <w:top w:val="single" w:color="CCCCCC" w:sz="1"/>
+              <w:left w:val="single" w:color="CCCCCC" w:sz="1"/>
+              <w:bottom w:val="single" w:color="CCCCCC" w:sz="1"/>
+              <w:right w:val="single" w:color="CCCCCC" w:sz="1"/>
+            </w:tcBorders>
+            <w:tcMar>
+              <w:top w:type="dxa" w:w="80"/>
+              <w:left w:type="dxa" w:w="120"/>
+              <w:bottom w:type="dxa" w:w="80"/>
+              <w:right w:type="dxa" w:w="120"/>
+            </w:tcMar>
+          </w:tcPr>
+          <w:p>
+            <w:r>
+              <w:rPr>
+                <w:rFonts w:ascii="Arial" w:cs="Arial" w:eastAsia="Arial" w:hAnsi="Arial"/>
+                <w:color w:val="222222"/>
+                <w:sz w:val="18"/>
+                <w:szCs w:val="18"/>
+              </w:rPr>
+              <w:t xml:space="preserve">temas_tuplas_json</w:t>
+            </w:r>
+          </w:p>
+        </w:tc>
+        <w:tc>
+          <w:tcPr>
+            <w:tcW w:type="dxa" w:w="1200"/>
+            <w:tcBorders>
+              <w:top w:val="single" w:color="CCCCCC" w:sz="1"/>
+              <w:left w:val="single" w:color="CCCCCC" w:sz="1"/>
+              <w:bottom w:val="single" w:color="CCCCCC" w:sz="1"/>
+              <w:right w:val="single" w:color="CCCCCC" w:sz="1"/>
+            </w:tcBorders>
+            <w:tcMar>
+              <w:top w:type="dxa" w:w="80"/>
+              <w:left w:type="dxa" w:w="120"/>
+              <w:bottom w:type="dxa" w:w="80"/>
+              <w:right w:type="dxa" w:w="120"/>
+            </w:tcMar>
+          </w:tcPr>
+          <w:p>
+            <w:r>
+              <w:rPr>
+                <w:rFonts w:ascii="Arial" w:cs="Arial" w:eastAsia="Arial" w:hAnsi="Arial"/>
+                <w:color w:val="222222"/>
+                <w:sz w:val="18"/>
+                <w:szCs w:val="18"/>
+              </w:rPr>
+              <w:t xml:space="preserve">JSON</w:t>
+            </w:r>
+          </w:p>
+        </w:tc>
+        <w:tc>
+          <w:tcPr>
+            <w:tcW w:type="dxa" w:w="5160"/>
+            <w:tcBorders>
+              <w:top w:val="single" w:color="CCCCCC" w:sz="1"/>
+              <w:left w:val="single" w:color="CCCCCC" w:sz="1"/>
+              <w:bottom w:val="single" w:color="CCCCCC" w:sz="1"/>
+              <w:right w:val="single" w:color="CCCCCC" w:sz="1"/>
+            </w:tcBorders>
+            <w:tcMar>
+              <w:top w:type="dxa" w:w="80"/>
+              <w:left w:type="dxa" w:w="120"/>
+              <w:bottom w:type="dxa" w:w="80"/>
+              <w:right w:type="dxa" w:w="120"/>
+            </w:tcMar>
+          </w:tcPr>
+          <w:p>
+            <w:r>
+              <w:rPr>
+                <w:rFonts w:ascii="Arial" w:cs="Arial" w:eastAsia="Arial" w:hAnsi="Arial"/>
+                <w:color w:val="222222"/>
+                <w:sz w:val="18"/>
+                <w:szCs w:val="18"/>
+              </w:rPr>
+              <w:t xml:space="preserve">União dos temas de todas as apensadas: [[nome, relevancia], ...]</w:t>
+            </w:r>
+          </w:p>
+        </w:tc>
+      </w:tr>
+      <w:tr>
+        <w:tc>
+          <w:tcPr>
+            <w:tcW w:type="dxa" w:w="2600"/>
+            <w:tcBorders>
+              <w:top w:val="single" w:color="CCCCCC" w:sz="1"/>
+              <w:left w:val="single" w:color="CCCCCC" w:sz="1"/>
+              <w:bottom w:val="single" w:color="CCCCCC" w:sz="1"/>
+              <w:right w:val="single" w:color="CCCCCC" w:sz="1"/>
+            </w:tcBorders>
+            <w:tcMar>
+              <w:top w:type="dxa" w:w="80"/>
+              <w:left w:type="dxa" w:w="120"/>
+              <w:bottom w:type="dxa" w:w="80"/>
+              <w:right w:type="dxa" w:w="120"/>
+            </w:tcMar>
+          </w:tcPr>
+          <w:p>
+            <w:r>
+              <w:rPr>
+                <w:rFonts w:ascii="Arial" w:cs="Arial" w:eastAsia="Arial" w:hAnsi="Arial"/>
+                <w:color w:val="222222"/>
+                <w:sz w:val="18"/>
+                <w:szCs w:val="18"/>
+              </w:rPr>
+              <w:t xml:space="preserve">autores_json</w:t>
+            </w:r>
+          </w:p>
+        </w:tc>
+        <w:tc>
+          <w:tcPr>
+            <w:tcW w:type="dxa" w:w="1200"/>
+            <w:tcBorders>
+              <w:top w:val="single" w:color="CCCCCC" w:sz="1"/>
+              <w:left w:val="single" w:color="CCCCCC" w:sz="1"/>
+              <w:bottom w:val="single" w:color="CCCCCC" w:sz="1"/>
+              <w:right w:val="single" w:color="CCCCCC" w:sz="1"/>
+            </w:tcBorders>
+            <w:tcMar>
+              <w:top w:type="dxa" w:w="80"/>
+              <w:left w:type="dxa" w:w="120"/>
+              <w:bottom w:type="dxa" w:w="80"/>
+              <w:right w:type="dxa" w:w="120"/>
+            </w:tcMar>
+          </w:tcPr>
+          <w:p>
+            <w:r>
+              <w:rPr>
+                <w:rFonts w:ascii="Arial" w:cs="Arial" w:eastAsia="Arial" w:hAnsi="Arial"/>
+                <w:color w:val="222222"/>
+                <w:sz w:val="18"/>
+                <w:szCs w:val="18"/>
+              </w:rPr>
+              <w:t xml:space="preserve">JSON</w:t>
+            </w:r>
+          </w:p>
+        </w:tc>
+        <w:tc>
+          <w:tcPr>
+            <w:tcW w:type="dxa" w:w="5160"/>
+            <w:tcBorders>
+              <w:top w:val="single" w:color="CCCCCC" w:sz="1"/>
+              <w:left w:val="single" w:color="CCCCCC" w:sz="1"/>
+              <w:bottom w:val="single" w:color="CCCCCC" w:sz="1"/>
+              <w:right w:val="single" w:color="CCCCCC" w:sz="1"/>
+            </w:tcBorders>
+            <w:tcMar>
+              <w:top w:type="dxa" w:w="80"/>
+              <w:left w:type="dxa" w:w="120"/>
+              <w:bottom w:type="dxa" w:w="80"/>
+              <w:right w:type="dxa" w:w="120"/>
+            </w:tcMar>
+          </w:tcPr>
+          <w:p>
+            <w:r>
+              <w:rPr>
+                <w:rFonts w:ascii="Arial" w:cs="Arial" w:eastAsia="Arial" w:hAnsi="Arial"/>
+                <w:color w:val="222222"/>
+                <w:sz w:val="18"/>
+                <w:szCs w:val="18"/>
+              </w:rPr>
+              <w:t xml:space="preserve">União de todos os autores (todos os tipos).</w:t>
+            </w:r>
+          </w:p>
+        </w:tc>
+      </w:tr>
+      <w:tr>
+        <w:tc>
+          <w:tcPr>
+            <w:tcW w:type="dxa" w:w="2600"/>
+            <w:tcBorders>
+              <w:top w:val="single" w:color="CCCCCC" w:sz="1"/>
+              <w:left w:val="single" w:color="CCCCCC" w:sz="1"/>
+              <w:bottom w:val="single" w:color="CCCCCC" w:sz="1"/>
+              <w:right w:val="single" w:color="CCCCCC" w:sz="1"/>
+            </w:tcBorders>
+            <w:tcMar>
+              <w:top w:type="dxa" w:w="80"/>
+              <w:left w:type="dxa" w:w="120"/>
+              <w:bottom w:type="dxa" w:w="80"/>
+              <w:right w:type="dxa" w:w="120"/>
+            </w:tcMar>
+          </w:tcPr>
+          <w:p>
+            <w:r>
+              <w:rPr>
+                <w:rFonts w:ascii="Arial" w:cs="Arial" w:eastAsia="Arial" w:hAnsi="Arial"/>
+                <w:color w:val="222222"/>
+                <w:sz w:val="18"/>
+                <w:szCs w:val="18"/>
+              </w:rPr>
+              <w:t xml:space="preserve">autores_deputados</w:t>
+            </w:r>
+          </w:p>
+        </w:tc>
+        <w:tc>
+          <w:tcPr>
+            <w:tcW w:type="dxa" w:w="1200"/>
+            <w:tcBorders>
+              <w:top w:val="single" w:color="CCCCCC" w:sz="1"/>
+              <w:left w:val="single" w:color="CCCCCC" w:sz="1"/>
+              <w:bottom w:val="single" w:color="CCCCCC" w:sz="1"/>
+              <w:right w:val="single" w:color="CCCCCC" w:sz="1"/>
+            </w:tcBorders>
+            <w:tcMar>
+              <w:top w:type="dxa" w:w="80"/>
+              <w:left w:type="dxa" w:w="120"/>
+              <w:bottom w:type="dxa" w:w="80"/>
+              <w:right w:type="dxa" w:w="120"/>
+            </w:tcMar>
+          </w:tcPr>
+          <w:p>
+            <w:r>
+              <w:rPr>
+                <w:rFonts w:ascii="Arial" w:cs="Arial" w:eastAsia="Arial" w:hAnsi="Arial"/>
+                <w:color w:val="222222"/>
+                <w:sz w:val="18"/>
+                <w:szCs w:val="18"/>
+              </w:rPr>
+              <w:t xml:space="preserve">JSON</w:t>
+            </w:r>
+          </w:p>
+        </w:tc>
+        <w:tc>
+          <w:tcPr>
+            <w:tcW w:type="dxa" w:w="5160"/>
+            <w:tcBorders>
+              <w:top w:val="single" w:color="CCCCCC" w:sz="1"/>
+              <w:left w:val="single" w:color="CCCCCC" w:sz="1"/>
+              <w:bottom w:val="single" w:color="CCCCCC" w:sz="1"/>
+              <w:right w:val="single" w:color="CCCCCC" w:sz="1"/>
+            </w:tcBorders>
+            <w:tcMar>
+              <w:top w:type="dxa" w:w="80"/>
+              <w:left w:type="dxa" w:w="120"/>
+              <w:bottom w:type="dxa" w:w="80"/>
+              <w:right w:type="dxa" w:w="120"/>
+            </w:tcMar>
+          </w:tcPr>
+          <w:p>
+            <w:r>
+              <w:rPr>
+                <w:rFonts w:ascii="Arial" w:cs="Arial" w:eastAsia="Arial" w:hAnsi="Arial"/>
+                <w:color w:val="222222"/>
+                <w:sz w:val="18"/>
+                <w:szCs w:val="18"/>
+              </w:rPr>
+              <w:t xml:space="preserve">Subset de autores_json com apenas deputados (codTipo==10000).</w:t>
+            </w:r>
+          </w:p>
+        </w:tc>
+      </w:tr>
+      <w:tr>
+        <w:tc>
+          <w:tcPr>
+            <w:tcW w:type="dxa" w:w="2600"/>
+            <w:tcBorders>
+              <w:top w:val="single" w:color="CCCCCC" w:sz="1"/>
+              <w:left w:val="single" w:color="CCCCCC" w:sz="1"/>
+              <w:bottom w:val="single" w:color="CCCCCC" w:sz="1"/>
+              <w:right w:val="single" w:color="CCCCCC" w:sz="1"/>
+            </w:tcBorders>
+            <w:tcMar>
+              <w:top w:type="dxa" w:w="80"/>
+              <w:left w:type="dxa" w:w="120"/>
+              <w:bottom w:type="dxa" w:w="80"/>
+              <w:right w:type="dxa" w:w="120"/>
+            </w:tcMar>
+          </w:tcPr>
+          <w:p>
+            <w:r>
+              <w:rPr>
+                <w:rFonts w:ascii="Arial" w:cs="Arial" w:eastAsia="Arial" w:hAnsi="Arial"/>
+                <w:color w:val="222222"/>
+                <w:sz w:val="18"/>
+                <w:szCs w:val="18"/>
+              </w:rPr>
+              <w:t xml:space="preserve">*__valores_distintos</w:t>
+            </w:r>
+          </w:p>
+        </w:tc>
+        <w:tc>
+          <w:tcPr>
+            <w:tcW w:type="dxa" w:w="1200"/>
+            <w:tcBorders>
+              <w:top w:val="single" w:color="CCCCCC" w:sz="1"/>
+              <w:left w:val="single" w:color="CCCCCC" w:sz="1"/>
+              <w:bottom w:val="single" w:color="CCCCCC" w:sz="1"/>
+              <w:right w:val="single" w:color="CCCCCC" w:sz="1"/>
+            </w:tcBorders>
+            <w:tcMar>
+              <w:top w:type="dxa" w:w="80"/>
+              <w:left w:type="dxa" w:w="120"/>
+              <w:bottom w:type="dxa" w:w="80"/>
+              <w:right w:type="dxa" w:w="120"/>
+            </w:tcMar>
+          </w:tcPr>
+          <w:p>
+            <w:r>
+              <w:rPr>
+                <w:rFonts w:ascii="Arial" w:cs="Arial" w:eastAsia="Arial" w:hAnsi="Arial"/>
+                <w:color w:val="222222"/>
+                <w:sz w:val="18"/>
+                <w:szCs w:val="18"/>
+              </w:rPr>
+              <w:t xml:space="preserve">JSON</w:t>
+            </w:r>
+          </w:p>
+        </w:tc>
+        <w:tc>
+          <w:tcPr>
+            <w:tcW w:type="dxa" w:w="5160"/>
+            <w:tcBorders>
+              <w:top w:val="single" w:color="CCCCCC" w:sz="1"/>
+              <w:left w:val="single" w:color="CCCCCC" w:sz="1"/>
+              <w:bottom w:val="single" w:color="CCCCCC" w:sz="1"/>
+              <w:right w:val="single" w:color="CCCCCC" w:sz="1"/>
+            </w:tcBorders>
+            <w:tcMar>
+              <w:top w:type="dxa" w:w="80"/>
+              <w:left w:type="dxa" w:w="120"/>
+              <w:bottom w:type="dxa" w:w="80"/>
+              <w:right w:type="dxa" w:w="120"/>
+            </w:tcMar>
+          </w:tcPr>
+          <w:p>
+            <w:r>
+              <w:rPr>
+                <w:rFonts w:ascii="Arial" w:cs="Arial" w:eastAsia="Arial" w:hAnsi="Arial"/>
+                <w:color w:val="222222"/>
+                <w:sz w:val="18"/>
+                <w:szCs w:val="18"/>
+              </w:rPr>
+              <w:t xml:space="preserve">Registra divergências de campos entre apensadas.</w:t>
+            </w:r>
+          </w:p>
+        </w:tc>
+      </w:tr>
+    </w:tbl>
+    <w:p>
+      <w:pPr>
+        <w:pBdr>
+          <w:bottom w:val="single" w:color="CCCCCC" w:sz="2" w:space="1"/>
+        </w:pBdr>
+        <w:spacing w:after="160" w:before="160"/>
+      </w:pPr>
+      <w:r>
+        <w:t xml:space="preserve"/>
+      </w:r>
+    </w:p>
+    <w:p>
+      <w:pPr>
+        <w:pStyle w:val="Heading1"/>
+        <w:pBdr>
+          <w:bottom w:val="single" w:color="2E75B6" w:sz="6" w:space="1"/>
+        </w:pBdr>
+        <w:spacing w:after="160" w:before="400"/>
+      </w:pPr>
+      <w:r>
+        <w:rPr>
+          <w:rFonts w:ascii="Arial" w:cs="Arial" w:eastAsia="Arial" w:hAnsi="Arial"/>
+          <w:b/>
+          <w:bCs/>
+          <w:color w:val="1F4E79"/>
+          <w:sz w:val="32"/>
+          <w:szCs w:val="32"/>
+        </w:rPr>
+        <w:t xml:space="preserve">5. Decisões Metodológicas</w:t>
+      </w:r>
+    </w:p>
+    <w:p>
+      <w:pPr>
+        <w:spacing w:after="60" w:before="60"/>
+      </w:pPr>
+      <w:r>
+        <w:rPr>
+          <w:rFonts w:ascii="Arial" w:cs="Arial" w:eastAsia="Arial" w:hAnsi="Arial"/>
+          <w:color w:val="222222"/>
+          <w:sz w:val="20"/>
+          <w:szCs w:val="20"/>
+        </w:rPr>
+        <w:t xml:space="preserve">Registro das decisões tomadas durante a exploração dos dados. Importante para justificar escolhas no contexto jornalístico.</w:t>
+      </w:r>
+    </w:p>
+    <w:p>
+      <w:pPr>
+        <w:spacing w:after="0" w:before="120"/>
+      </w:pPr>
+      <w:r>
+        <w:t xml:space="preserve"/>
+      </w:r>
+    </w:p>
+    <w:tbl>
+      <w:tblPr>
+        <w:tblW w:type="dxa" w:w="8960"/>
+        <w:tblBorders>
+          <w:top w:val="single" w:color="auto" w:sz="4"/>
+          <w:left w:val="single" w:color="auto" w:sz="4"/>
+          <w:bottom w:val="single" w:color="auto" w:sz="4"/>
+          <w:right w:val="single" w:color="auto" w:sz="4"/>
+          <w:insideH w:val="single" w:color="auto" w:sz="4"/>
+          <w:insideV w:val="single" w:color="auto" w:sz="4"/>
+        </w:tblBorders>
+      </w:tblPr>
+      <w:tblGrid>
+        <w:gridCol w:w="2400"/>
+        <w:gridCol w:w="2000"/>
         <w:gridCol w:w="4560"/>
       </w:tblGrid>
       <w:tr>
         <w:tc>
           <w:tcPr>
-            <w:tcW w:type="dxa" w:w="2200"/>
+            <w:tcW w:type="dxa" w:w="2400"/>
             <w:tcBorders>
               <w:top w:val="single" w:color="CCCCCC" w:sz="1"/>
               <w:left w:val="single" w:color="CCCCCC" w:sz="1"/>
@@ -2583,7 +4673,7 @@
         </w:tc>
         <w:tc>
           <w:tcPr>
-            <w:tcW w:type="dxa" w:w="2200"/>
+            <w:tcW w:type="dxa" w:w="2000"/>
             <w:tcBorders>
               <w:top w:val="single" w:color="CCCCCC" w:sz="1"/>
               <w:left w:val="single" w:color="CCCCCC" w:sz="1"/>
@@ -2647,7 +4737,7 @@
       <w:tr>
         <w:tc>
           <w:tcPr>
-            <w:tcW w:type="dxa" w:w="2200"/>
+            <w:tcW w:type="dxa" w:w="2400"/>
             <w:tcBorders>
               <w:top w:val="single" w:color="CCCCCC" w:sz="1"/>
               <w:left w:val="single" w:color="CCCCCC" w:sz="1"/>
@@ -2675,7 +4765,7 @@
         </w:tc>
         <w:tc>
           <w:tcPr>
-            <w:tcW w:type="dxa" w:w="2200"/>
+            <w:tcW w:type="dxa" w:w="2000"/>
             <w:tcBorders>
               <w:top w:val="single" w:color="CCCCCC" w:sz="1"/>
               <w:left w:val="single" w:color="CCCCCC" w:sz="1"/>
@@ -2725,7 +4815,7 @@
                 <w:sz w:val="18"/>
                 <w:szCs w:val="18"/>
               </w:rPr>
-              <w:t xml:space="preserve">A API da Câmara não é mantida o suficiente para justificar granularidade maior. Classes intermediárias são inconsistentes.</w:t>
+              <w:t xml:space="preserve">A API da Câmara não é mantida o suficiente para justificar granularidade maior.</w:t>
             </w:r>
           </w:p>
         </w:tc>
@@ -2733,7 +4823,7 @@
       <w:tr>
         <w:tc>
           <w:tcPr>
-            <w:tcW w:type="dxa" w:w="2200"/>
+            <w:tcW w:type="dxa" w:w="2400"/>
             <w:tcBorders>
               <w:top w:val="single" w:color="CCCCCC" w:sz="1"/>
               <w:left w:val="single" w:color="CCCCCC" w:sz="1"/>
@@ -2761,7 +4851,7 @@
         </w:tc>
         <w:tc>
           <w:tcPr>
-            <w:tcW w:type="dxa" w:w="2200"/>
+            <w:tcW w:type="dxa" w:w="2000"/>
             <w:tcBorders>
               <w:top w:val="single" w:color="CCCCCC" w:sz="1"/>
               <w:left w:val="single" w:color="CCCCCC" w:sz="1"/>
@@ -2811,7 +4901,7 @@
                 <w:sz w:val="18"/>
                 <w:szCs w:val="18"/>
               </w:rPr>
-              <w:t xml:space="preserve">Para jornalismo, a distinção não agrega valor suficiente. Pode ser reintroduzida no dashboard via filtro se necessário.</w:t>
+              <w:t xml:space="preserve">Para jornalismo, a distinção não agrega valor suficiente no MVP.</w:t>
             </w:r>
           </w:p>
         </w:tc>
@@ -2819,57 +4909,57 @@
       <w:tr>
         <w:tc>
           <w:tcPr>
-            <w:tcW w:type="dxa" w:w="2200"/>
-            <w:tcBorders>
-              <w:top w:val="single" w:color="CCCCCC" w:sz="1"/>
-              <w:left w:val="single" w:color="CCCCCC" w:sz="1"/>
-              <w:bottom w:val="single" w:color="CCCCCC" w:sz="1"/>
-              <w:right w:val="single" w:color="CCCCCC" w:sz="1"/>
-            </w:tcBorders>
-            <w:tcMar>
-              <w:top w:type="dxa" w:w="80"/>
-              <w:left w:type="dxa" w:w="120"/>
-              <w:bottom w:type="dxa" w:w="80"/>
-              <w:right w:type="dxa" w:w="120"/>
-            </w:tcMar>
-          </w:tcPr>
-          <w:p>
-            <w:r>
-              <w:rPr>
-                <w:rFonts w:ascii="Arial" w:cs="Arial" w:eastAsia="Arial" w:hAnsi="Arial"/>
-                <w:color w:val="222222"/>
-                <w:sz w:val="18"/>
-                <w:szCs w:val="18"/>
-              </w:rPr>
-              <w:t xml:space="preserve">Indefinidos e Devolvidos</w:t>
-            </w:r>
-          </w:p>
-        </w:tc>
-        <w:tc>
-          <w:tcPr>
-            <w:tcW w:type="dxa" w:w="2200"/>
-            <w:tcBorders>
-              <w:top w:val="single" w:color="CCCCCC" w:sz="1"/>
-              <w:left w:val="single" w:color="CCCCCC" w:sz="1"/>
-              <w:bottom w:val="single" w:color="CCCCCC" w:sz="1"/>
-              <w:right w:val="single" w:color="CCCCCC" w:sz="1"/>
-            </w:tcBorders>
-            <w:tcMar>
-              <w:top w:type="dxa" w:w="80"/>
-              <w:left w:type="dxa" w:w="120"/>
-              <w:bottom w:type="dxa" w:w="80"/>
-              <w:right w:type="dxa" w:w="120"/>
-            </w:tcMar>
-          </w:tcPr>
-          <w:p>
-            <w:r>
-              <w:rPr>
-                <w:rFonts w:ascii="Arial" w:cs="Arial" w:eastAsia="Arial" w:hAnsi="Arial"/>
-                <w:color w:val="222222"/>
-                <w:sz w:val="18"/>
-                <w:szCs w:val="18"/>
-              </w:rPr>
-              <w:t xml:space="preserve">Vão para Arquivada</w:t>
+            <w:tcW w:type="dxa" w:w="2400"/>
+            <w:tcBorders>
+              <w:top w:val="single" w:color="CCCCCC" w:sz="1"/>
+              <w:left w:val="single" w:color="CCCCCC" w:sz="1"/>
+              <w:bottom w:val="single" w:color="CCCCCC" w:sz="1"/>
+              <w:right w:val="single" w:color="CCCCCC" w:sz="1"/>
+            </w:tcBorders>
+            <w:tcMar>
+              <w:top w:type="dxa" w:w="80"/>
+              <w:left w:type="dxa" w:w="120"/>
+              <w:bottom w:type="dxa" w:w="80"/>
+              <w:right w:type="dxa" w:w="120"/>
+            </w:tcMar>
+          </w:tcPr>
+          <w:p>
+            <w:r>
+              <w:rPr>
+                <w:rFonts w:ascii="Arial" w:cs="Arial" w:eastAsia="Arial" w:hAnsi="Arial"/>
+                <w:color w:val="222222"/>
+                <w:sz w:val="18"/>
+                <w:szCs w:val="18"/>
+              </w:rPr>
+              <w:t xml:space="preserve">Situação do grupo de apensadas</w:t>
+            </w:r>
+          </w:p>
+        </w:tc>
+        <w:tc>
+          <w:tcPr>
+            <w:tcW w:type="dxa" w:w="2000"/>
+            <w:tcBorders>
+              <w:top w:val="single" w:color="CCCCCC" w:sz="1"/>
+              <w:left w:val="single" w:color="CCCCCC" w:sz="1"/>
+              <w:bottom w:val="single" w:color="CCCCCC" w:sz="1"/>
+              <w:right w:val="single" w:color="CCCCCC" w:sz="1"/>
+            </w:tcBorders>
+            <w:tcMar>
+              <w:top w:type="dxa" w:w="80"/>
+              <w:left w:type="dxa" w:w="120"/>
+              <w:bottom w:type="dxa" w:w="80"/>
+              <w:right w:type="dxa" w:w="120"/>
+            </w:tcMar>
+          </w:tcPr>
+          <w:p>
+            <w:r>
+              <w:rPr>
+                <w:rFonts w:ascii="Arial" w:cs="Arial" w:eastAsia="Arial" w:hAnsi="Arial"/>
+                <w:color w:val="222222"/>
+                <w:sz w:val="18"/>
+                <w:szCs w:val="18"/>
+              </w:rPr>
+              <w:t xml:space="preserve">Hierarquia Norma &gt; Arquivada &gt; Tramitação</w:t>
             </w:r>
           </w:p>
         </w:tc>
@@ -2897,7 +4987,7 @@
                 <w:sz w:val="18"/>
                 <w:szCs w:val="18"/>
               </w:rPr>
-              <w:t xml:space="preserve">Proposição saiu de circulação de qualquer forma. Tratar como ruído da fonte.</w:t>
+              <w:t xml:space="preserve">Se qualquer membro virou norma, o grupo virou norma. Faz sentido jornalisticamente.</w:t>
             </w:r>
           </w:p>
         </w:tc>
@@ -2905,57 +4995,57 @@
       <w:tr>
         <w:tc>
           <w:tcPr>
-            <w:tcW w:type="dxa" w:w="2200"/>
-            <w:tcBorders>
-              <w:top w:val="single" w:color="CCCCCC" w:sz="1"/>
-              <w:left w:val="single" w:color="CCCCCC" w:sz="1"/>
-              <w:bottom w:val="single" w:color="CCCCCC" w:sz="1"/>
-              <w:right w:val="single" w:color="CCCCCC" w:sz="1"/>
-            </w:tcBorders>
-            <w:tcMar>
-              <w:top w:type="dxa" w:w="80"/>
-              <w:left w:type="dxa" w:w="120"/>
-              <w:bottom w:type="dxa" w:w="80"/>
-              <w:right w:type="dxa" w:w="120"/>
-            </w:tcMar>
-          </w:tcPr>
-          <w:p>
-            <w:r>
-              <w:rPr>
-                <w:rFonts w:ascii="Arial" w:cs="Arial" w:eastAsia="Arial" w:hAnsi="Arial"/>
-                <w:color w:val="222222"/>
-                <w:sz w:val="18"/>
-                <w:szCs w:val="18"/>
-              </w:rPr>
-              <w:t xml:space="preserve">Colapso de apensadas</w:t>
-            </w:r>
-          </w:p>
-        </w:tc>
-        <w:tc>
-          <w:tcPr>
-            <w:tcW w:type="dxa" w:w="2200"/>
-            <w:tcBorders>
-              <w:top w:val="single" w:color="CCCCCC" w:sz="1"/>
-              <w:left w:val="single" w:color="CCCCCC" w:sz="1"/>
-              <w:bottom w:val="single" w:color="CCCCCC" w:sz="1"/>
-              <w:right w:val="single" w:color="CCCCCC" w:sz="1"/>
-            </w:tcBorders>
-            <w:tcMar>
-              <w:top w:type="dxa" w:w="80"/>
-              <w:left w:type="dxa" w:w="120"/>
-              <w:bottom w:type="dxa" w:w="80"/>
-              <w:right w:type="dxa" w:w="120"/>
-            </w:tcMar>
-          </w:tcPr>
-          <w:p>
-            <w:r>
-              <w:rPr>
-                <w:rFonts w:ascii="Arial" w:cs="Arial" w:eastAsia="Arial" w:hAnsi="Arial"/>
-                <w:color w:val="222222"/>
-                <w:sz w:val="18"/>
-                <w:szCs w:val="18"/>
-              </w:rPr>
-              <w:t xml:space="preserve">Colapsar por uriPropPrincipal e prop_original</w:t>
+            <w:tcW w:type="dxa" w:w="2400"/>
+            <w:tcBorders>
+              <w:top w:val="single" w:color="CCCCCC" w:sz="1"/>
+              <w:left w:val="single" w:color="CCCCCC" w:sz="1"/>
+              <w:bottom w:val="single" w:color="CCCCCC" w:sz="1"/>
+              <w:right w:val="single" w:color="CCCCCC" w:sz="1"/>
+            </w:tcBorders>
+            <w:tcMar>
+              <w:top w:type="dxa" w:w="80"/>
+              <w:left w:type="dxa" w:w="120"/>
+              <w:bottom w:type="dxa" w:w="80"/>
+              <w:right w:type="dxa" w:w="120"/>
+            </w:tcMar>
+          </w:tcPr>
+          <w:p>
+            <w:r>
+              <w:rPr>
+                <w:rFonts w:ascii="Arial" w:cs="Arial" w:eastAsia="Arial" w:hAnsi="Arial"/>
+                <w:color w:val="222222"/>
+                <w:sz w:val="18"/>
+                <w:szCs w:val="18"/>
+              </w:rPr>
+              <w:t xml:space="preserve">ultimoStatus_* no grupo</w:t>
+            </w:r>
+          </w:p>
+        </w:tc>
+        <w:tc>
+          <w:tcPr>
+            <w:tcW w:type="dxa" w:w="2000"/>
+            <w:tcBorders>
+              <w:top w:val="single" w:color="CCCCCC" w:sz="1"/>
+              <w:left w:val="single" w:color="CCCCCC" w:sz="1"/>
+              <w:bottom w:val="single" w:color="CCCCCC" w:sz="1"/>
+              <w:right w:val="single" w:color="CCCCCC" w:sz="1"/>
+            </w:tcBorders>
+            <w:tcMar>
+              <w:top w:type="dxa" w:w="80"/>
+              <w:left w:type="dxa" w:w="120"/>
+              <w:bottom w:type="dxa" w:w="80"/>
+              <w:right w:type="dxa" w:w="120"/>
+            </w:tcMar>
+          </w:tcPr>
+          <w:p>
+            <w:r>
+              <w:rPr>
+                <w:rFonts w:ascii="Arial" w:cs="Arial" w:eastAsia="Arial" w:hAnsi="Arial"/>
+                <w:color w:val="222222"/>
+                <w:sz w:val="18"/>
+                <w:szCs w:val="18"/>
+              </w:rPr>
+              <w:t xml:space="preserve">Vêm da proposição que determinou a situação</w:t>
             </w:r>
           </w:p>
         </w:tc>
@@ -2983,7 +5073,7 @@
                 <w:sz w:val="18"/>
                 <w:szCs w:val="18"/>
               </w:rPr>
-              <w:t xml:space="preserve">Apensadas tramitam juntas pois tratam do mesmo assunto. Faz sentido jornalisticamente tratá-las como uma unidade.</w:t>
+              <w:t xml:space="preserve">Mais informativo do que usar sempre o representante eleito.</w:t>
             </w:r>
           </w:p>
         </w:tc>
@@ -2991,57 +5081,57 @@
       <w:tr>
         <w:tc>
           <w:tcPr>
-            <w:tcW w:type="dxa" w:w="2200"/>
-            <w:tcBorders>
-              <w:top w:val="single" w:color="CCCCCC" w:sz="1"/>
-              <w:left w:val="single" w:color="CCCCCC" w:sz="1"/>
-              <w:bottom w:val="single" w:color="CCCCCC" w:sz="1"/>
-              <w:right w:val="single" w:color="CCCCCC" w:sz="1"/>
-            </w:tcBorders>
-            <w:tcMar>
-              <w:top w:type="dxa" w:w="80"/>
-              <w:left w:type="dxa" w:w="120"/>
-              <w:bottom w:type="dxa" w:w="80"/>
-              <w:right w:type="dxa" w:w="120"/>
-            </w:tcMar>
-          </w:tcPr>
-          <w:p>
-            <w:r>
-              <w:rPr>
-                <w:rFonts w:ascii="Arial" w:cs="Arial" w:eastAsia="Arial" w:hAnsi="Arial"/>
-                <w:color w:val="222222"/>
-                <w:sz w:val="18"/>
-                <w:szCs w:val="18"/>
-              </w:rPr>
-              <w:t xml:space="preserve">Ementa quase igual mas não apensada</w:t>
-            </w:r>
-          </w:p>
-        </w:tc>
-        <w:tc>
-          <w:tcPr>
-            <w:tcW w:type="dxa" w:w="2200"/>
-            <w:tcBorders>
-              <w:top w:val="single" w:color="CCCCCC" w:sz="1"/>
-              <w:left w:val="single" w:color="CCCCCC" w:sz="1"/>
-              <w:bottom w:val="single" w:color="CCCCCC" w:sz="1"/>
-              <w:right w:val="single" w:color="CCCCCC" w:sz="1"/>
-            </w:tcBorders>
-            <w:tcMar>
-              <w:top w:type="dxa" w:w="80"/>
-              <w:left w:type="dxa" w:w="120"/>
-              <w:bottom w:type="dxa" w:w="80"/>
-              <w:right w:type="dxa" w:w="120"/>
-            </w:tcMar>
-          </w:tcPr>
-          <w:p>
-            <w:r>
-              <w:rPr>
-                <w:rFonts w:ascii="Arial" w:cs="Arial" w:eastAsia="Arial" w:hAnsi="Arial"/>
-                <w:color w:val="222222"/>
-                <w:sz w:val="18"/>
-                <w:szCs w:val="18"/>
-              </w:rPr>
-              <w:t xml:space="preserve">Deixar separadas</w:t>
+            <w:tcW w:type="dxa" w:w="2400"/>
+            <w:tcBorders>
+              <w:top w:val="single" w:color="CCCCCC" w:sz="1"/>
+              <w:left w:val="single" w:color="CCCCCC" w:sz="1"/>
+              <w:bottom w:val="single" w:color="CCCCCC" w:sz="1"/>
+              <w:right w:val="single" w:color="CCCCCC" w:sz="1"/>
+            </w:tcBorders>
+            <w:tcMar>
+              <w:top w:type="dxa" w:w="80"/>
+              <w:left w:type="dxa" w:w="120"/>
+              <w:bottom w:type="dxa" w:w="80"/>
+              <w:right w:type="dxa" w:w="120"/>
+            </w:tcMar>
+          </w:tcPr>
+          <w:p>
+            <w:r>
+              <w:rPr>
+                <w:rFonts w:ascii="Arial" w:cs="Arial" w:eastAsia="Arial" w:hAnsi="Arial"/>
+                <w:color w:val="222222"/>
+                <w:sz w:val="18"/>
+                <w:szCs w:val="18"/>
+              </w:rPr>
+              <w:t xml:space="preserve">Indefinidos e Devolvidos (cód. 1120)</w:t>
+            </w:r>
+          </w:p>
+        </w:tc>
+        <w:tc>
+          <w:tcPr>
+            <w:tcW w:type="dxa" w:w="2000"/>
+            <w:tcBorders>
+              <w:top w:val="single" w:color="CCCCCC" w:sz="1"/>
+              <w:left w:val="single" w:color="CCCCCC" w:sz="1"/>
+              <w:bottom w:val="single" w:color="CCCCCC" w:sz="1"/>
+              <w:right w:val="single" w:color="CCCCCC" w:sz="1"/>
+            </w:tcBorders>
+            <w:tcMar>
+              <w:top w:type="dxa" w:w="80"/>
+              <w:left w:type="dxa" w:w="120"/>
+              <w:bottom w:type="dxa" w:w="80"/>
+              <w:right w:type="dxa" w:w="120"/>
+            </w:tcMar>
+          </w:tcPr>
+          <w:p>
+            <w:r>
+              <w:rPr>
+                <w:rFonts w:ascii="Arial" w:cs="Arial" w:eastAsia="Arial" w:hAnsi="Arial"/>
+                <w:color w:val="222222"/>
+                <w:sz w:val="18"/>
+                <w:szCs w:val="18"/>
+              </w:rPr>
+              <w:t xml:space="preserve">Vão para Arquivada</w:t>
             </w:r>
           </w:p>
         </w:tc>
@@ -3069,7 +5159,7 @@
                 <w:sz w:val="18"/>
                 <w:szCs w:val="18"/>
               </w:rPr>
-              <w:t xml:space="preserve">Colapsar por similaridade de ementa introduziria inferências não feitas pela Câmara. Documentar como limitação.</w:t>
+              <w:t xml:space="preserve">Proposição saiu de circulação. Tratar como ruído da fonte.</w:t>
             </w:r>
           </w:p>
         </w:tc>
@@ -3077,57 +5167,57 @@
       <w:tr>
         <w:tc>
           <w:tcPr>
-            <w:tcW w:type="dxa" w:w="2200"/>
-            <w:tcBorders>
-              <w:top w:val="single" w:color="CCCCCC" w:sz="1"/>
-              <w:left w:val="single" w:color="CCCCCC" w:sz="1"/>
-              <w:bottom w:val="single" w:color="CCCCCC" w:sz="1"/>
-              <w:right w:val="single" w:color="CCCCCC" w:sz="1"/>
-            </w:tcBorders>
-            <w:tcMar>
-              <w:top w:type="dxa" w:w="80"/>
-              <w:left w:type="dxa" w:w="120"/>
-              <w:bottom w:type="dxa" w:w="80"/>
-              <w:right w:type="dxa" w:w="120"/>
-            </w:tcMar>
-          </w:tcPr>
-          <w:p>
-            <w:r>
-              <w:rPr>
-                <w:rFonts w:ascii="Arial" w:cs="Arial" w:eastAsia="Arial" w:hAnsi="Arial"/>
-                <w:color w:val="222222"/>
-                <w:sz w:val="18"/>
-                <w:szCs w:val="18"/>
-              </w:rPr>
-              <w:t xml:space="preserve">PDC vs PDL</w:t>
-            </w:r>
-          </w:p>
-        </w:tc>
-        <w:tc>
-          <w:tcPr>
-            <w:tcW w:type="dxa" w:w="2200"/>
-            <w:tcBorders>
-              <w:top w:val="single" w:color="CCCCCC" w:sz="1"/>
-              <w:left w:val="single" w:color="CCCCCC" w:sz="1"/>
-              <w:bottom w:val="single" w:color="CCCCCC" w:sz="1"/>
-              <w:right w:val="single" w:color="CCCCCC" w:sz="1"/>
-            </w:tcBorders>
-            <w:tcMar>
-              <w:top w:type="dxa" w:w="80"/>
-              <w:left w:type="dxa" w:w="120"/>
-              <w:bottom w:type="dxa" w:w="80"/>
-              <w:right w:type="dxa" w:w="120"/>
-            </w:tcMar>
-          </w:tcPr>
-          <w:p>
-            <w:r>
-              <w:rPr>
-                <w:rFonts w:ascii="Arial" w:cs="Arial" w:eastAsia="Arial" w:hAnsi="Arial"/>
-                <w:color w:val="222222"/>
-                <w:sz w:val="18"/>
-                <w:szCs w:val="18"/>
-              </w:rPr>
-              <w:t xml:space="preserve">Incluir os dois</w:t>
+            <w:tcW w:type="dxa" w:w="2400"/>
+            <w:tcBorders>
+              <w:top w:val="single" w:color="CCCCCC" w:sz="1"/>
+              <w:left w:val="single" w:color="CCCCCC" w:sz="1"/>
+              <w:bottom w:val="single" w:color="CCCCCC" w:sz="1"/>
+              <w:right w:val="single" w:color="CCCCCC" w:sz="1"/>
+            </w:tcBorders>
+            <w:tcMar>
+              <w:top w:type="dxa" w:w="80"/>
+              <w:left w:type="dxa" w:w="120"/>
+              <w:bottom w:type="dxa" w:w="80"/>
+              <w:right w:type="dxa" w:w="120"/>
+            </w:tcMar>
+          </w:tcPr>
+          <w:p>
+            <w:r>
+              <w:rPr>
+                <w:rFonts w:ascii="Arial" w:cs="Arial" w:eastAsia="Arial" w:hAnsi="Arial"/>
+                <w:color w:val="222222"/>
+                <w:sz w:val="18"/>
+                <w:szCs w:val="18"/>
+              </w:rPr>
+              <w:t xml:space="preserve">Colapso de apensadas</w:t>
+            </w:r>
+          </w:p>
+        </w:tc>
+        <w:tc>
+          <w:tcPr>
+            <w:tcW w:type="dxa" w:w="2000"/>
+            <w:tcBorders>
+              <w:top w:val="single" w:color="CCCCCC" w:sz="1"/>
+              <w:left w:val="single" w:color="CCCCCC" w:sz="1"/>
+              <w:bottom w:val="single" w:color="CCCCCC" w:sz="1"/>
+              <w:right w:val="single" w:color="CCCCCC" w:sz="1"/>
+            </w:tcBorders>
+            <w:tcMar>
+              <w:top w:type="dxa" w:w="80"/>
+              <w:left w:type="dxa" w:w="120"/>
+              <w:bottom w:type="dxa" w:w="80"/>
+              <w:right w:type="dxa" w:w="120"/>
+            </w:tcMar>
+          </w:tcPr>
+          <w:p>
+            <w:r>
+              <w:rPr>
+                <w:rFonts w:ascii="Arial" w:cs="Arial" w:eastAsia="Arial" w:hAnsi="Arial"/>
+                <w:color w:val="222222"/>
+                <w:sz w:val="18"/>
+                <w:szCs w:val="18"/>
+              </w:rPr>
+              <w:t xml:space="preserve">Union-Find por uriPropPrincipal</w:t>
             </w:r>
           </w:p>
         </w:tc>
@@ -3155,7 +5245,7 @@
                 <w:sz w:val="18"/>
                 <w:szCs w:val="18"/>
               </w:rPr>
-              <w:t xml:space="preserve">São a mesma figura legislativa com siglas diferentes entre legislaturas.</w:t>
+              <w:t xml:space="preserve">Resolve cadeias A→B→C automaticamente sem múltiplas passagens.</w:t>
             </w:r>
           </w:p>
         </w:tc>
@@ -3163,57 +5253,57 @@
       <w:tr>
         <w:tc>
           <w:tcPr>
-            <w:tcW w:type="dxa" w:w="2200"/>
-            <w:tcBorders>
-              <w:top w:val="single" w:color="CCCCCC" w:sz="1"/>
-              <w:left w:val="single" w:color="CCCCCC" w:sz="1"/>
-              <w:bottom w:val="single" w:color="CCCCCC" w:sz="1"/>
-              <w:right w:val="single" w:color="CCCCCC" w:sz="1"/>
-            </w:tcBorders>
-            <w:tcMar>
-              <w:top w:type="dxa" w:w="80"/>
-              <w:left w:type="dxa" w:w="120"/>
-              <w:bottom w:type="dxa" w:w="80"/>
-              <w:right w:type="dxa" w:w="120"/>
-            </w:tcMar>
-          </w:tcPr>
-          <w:p>
-            <w:r>
-              <w:rPr>
-                <w:rFonts w:ascii="Arial" w:cs="Arial" w:eastAsia="Arial" w:hAnsi="Arial"/>
-                <w:color w:val="222222"/>
-                <w:sz w:val="18"/>
-                <w:szCs w:val="18"/>
-              </w:rPr>
-              <w:t xml:space="preserve">Temas leg. 56 sem tema</w:t>
-            </w:r>
-          </w:p>
-        </w:tc>
-        <w:tc>
-          <w:tcPr>
-            <w:tcW w:type="dxa" w:w="2200"/>
-            <w:tcBorders>
-              <w:top w:val="single" w:color="CCCCCC" w:sz="1"/>
-              <w:left w:val="single" w:color="CCCCCC" w:sz="1"/>
-              <w:bottom w:val="single" w:color="CCCCCC" w:sz="1"/>
-              <w:right w:val="single" w:color="CCCCCC" w:sz="1"/>
-            </w:tcBorders>
-            <w:tcMar>
-              <w:top w:type="dxa" w:w="80"/>
-              <w:left w:type="dxa" w:w="120"/>
-              <w:bottom w:type="dxa" w:w="80"/>
-              <w:right w:type="dxa" w:w="120"/>
-            </w:tcMar>
-          </w:tcPr>
-          <w:p>
-            <w:r>
-              <w:rPr>
-                <w:rFonts w:ascii="Arial" w:cs="Arial" w:eastAsia="Arial" w:hAnsi="Arial"/>
-                <w:color w:val="222222"/>
-                <w:sz w:val="18"/>
-                <w:szCs w:val="18"/>
-              </w:rPr>
-              <w:t xml:space="preserve">GPT como fallback opcional</w:t>
+            <w:tcW w:type="dxa" w:w="2400"/>
+            <w:tcBorders>
+              <w:top w:val="single" w:color="CCCCCC" w:sz="1"/>
+              <w:left w:val="single" w:color="CCCCCC" w:sz="1"/>
+              <w:bottom w:val="single" w:color="CCCCCC" w:sz="1"/>
+              <w:right w:val="single" w:color="CCCCCC" w:sz="1"/>
+            </w:tcBorders>
+            <w:tcMar>
+              <w:top w:type="dxa" w:w="80"/>
+              <w:left w:type="dxa" w:w="120"/>
+              <w:bottom w:type="dxa" w:w="80"/>
+              <w:right w:type="dxa" w:w="120"/>
+            </w:tcMar>
+          </w:tcPr>
+          <w:p>
+            <w:r>
+              <w:rPr>
+                <w:rFonts w:ascii="Arial" w:cs="Arial" w:eastAsia="Arial" w:hAnsi="Arial"/>
+                <w:color w:val="222222"/>
+                <w:sz w:val="18"/>
+                <w:szCs w:val="18"/>
+              </w:rPr>
+              <w:t xml:space="preserve">Ementa quase igual mas não apensada</w:t>
+            </w:r>
+          </w:p>
+        </w:tc>
+        <w:tc>
+          <w:tcPr>
+            <w:tcW w:type="dxa" w:w="2000"/>
+            <w:tcBorders>
+              <w:top w:val="single" w:color="CCCCCC" w:sz="1"/>
+              <w:left w:val="single" w:color="CCCCCC" w:sz="1"/>
+              <w:bottom w:val="single" w:color="CCCCCC" w:sz="1"/>
+              <w:right w:val="single" w:color="CCCCCC" w:sz="1"/>
+            </w:tcBorders>
+            <w:tcMar>
+              <w:top w:type="dxa" w:w="80"/>
+              <w:left w:type="dxa" w:w="120"/>
+              <w:bottom w:type="dxa" w:w="80"/>
+              <w:right w:type="dxa" w:w="120"/>
+            </w:tcMar>
+          </w:tcPr>
+          <w:p>
+            <w:r>
+              <w:rPr>
+                <w:rFonts w:ascii="Arial" w:cs="Arial" w:eastAsia="Arial" w:hAnsi="Arial"/>
+                <w:color w:val="222222"/>
+                <w:sz w:val="18"/>
+                <w:szCs w:val="18"/>
+              </w:rPr>
+              <w:t xml:space="preserve">Deixar separadas</w:t>
             </w:r>
           </w:p>
         </w:tc>
@@ -3241,7 +5331,7 @@
                 <w:sz w:val="18"/>
                 <w:szCs w:val="18"/>
               </w:rPr>
-              <w:t xml:space="preserve">A Câmara atualizou retroativamente. Apenas ~50 props sem tema em abril/2026. GPT não é mais necessário no pipeline principal.</w:t>
+              <w:t xml:space="preserve">Colapsar por similaridade introduziria inferências não feitas pela Câmara.</w:t>
             </w:r>
           </w:p>
         </w:tc>
@@ -3249,7 +5339,179 @@
       <w:tr>
         <w:tc>
           <w:tcPr>
-            <w:tcW w:type="dxa" w:w="2200"/>
+            <w:tcW w:type="dxa" w:w="2400"/>
+            <w:tcBorders>
+              <w:top w:val="single" w:color="CCCCCC" w:sz="1"/>
+              <w:left w:val="single" w:color="CCCCCC" w:sz="1"/>
+              <w:bottom w:val="single" w:color="CCCCCC" w:sz="1"/>
+              <w:right w:val="single" w:color="CCCCCC" w:sz="1"/>
+            </w:tcBorders>
+            <w:tcMar>
+              <w:top w:type="dxa" w:w="80"/>
+              <w:left w:type="dxa" w:w="120"/>
+              <w:bottom w:type="dxa" w:w="80"/>
+              <w:right w:type="dxa" w:w="120"/>
+            </w:tcMar>
+          </w:tcPr>
+          <w:p>
+            <w:r>
+              <w:rPr>
+                <w:rFonts w:ascii="Arial" w:cs="Arial" w:eastAsia="Arial" w:hAnsi="Arial"/>
+                <w:color w:val="222222"/>
+                <w:sz w:val="18"/>
+                <w:szCs w:val="18"/>
+              </w:rPr>
+              <w:t xml:space="preserve">PDC vs PDL</w:t>
+            </w:r>
+          </w:p>
+        </w:tc>
+        <w:tc>
+          <w:tcPr>
+            <w:tcW w:type="dxa" w:w="2000"/>
+            <w:tcBorders>
+              <w:top w:val="single" w:color="CCCCCC" w:sz="1"/>
+              <w:left w:val="single" w:color="CCCCCC" w:sz="1"/>
+              <w:bottom w:val="single" w:color="CCCCCC" w:sz="1"/>
+              <w:right w:val="single" w:color="CCCCCC" w:sz="1"/>
+            </w:tcBorders>
+            <w:tcMar>
+              <w:top w:type="dxa" w:w="80"/>
+              <w:left w:type="dxa" w:w="120"/>
+              <w:bottom w:type="dxa" w:w="80"/>
+              <w:right w:type="dxa" w:w="120"/>
+            </w:tcMar>
+          </w:tcPr>
+          <w:p>
+            <w:r>
+              <w:rPr>
+                <w:rFonts w:ascii="Arial" w:cs="Arial" w:eastAsia="Arial" w:hAnsi="Arial"/>
+                <w:color w:val="222222"/>
+                <w:sz w:val="18"/>
+                <w:szCs w:val="18"/>
+              </w:rPr>
+              <w:t xml:space="preserve">Incluir os dois</w:t>
+            </w:r>
+          </w:p>
+        </w:tc>
+        <w:tc>
+          <w:tcPr>
+            <w:tcW w:type="dxa" w:w="4560"/>
+            <w:tcBorders>
+              <w:top w:val="single" w:color="CCCCCC" w:sz="1"/>
+              <w:left w:val="single" w:color="CCCCCC" w:sz="1"/>
+              <w:bottom w:val="single" w:color="CCCCCC" w:sz="1"/>
+              <w:right w:val="single" w:color="CCCCCC" w:sz="1"/>
+            </w:tcBorders>
+            <w:tcMar>
+              <w:top w:type="dxa" w:w="80"/>
+              <w:left w:type="dxa" w:w="120"/>
+              <w:bottom w:type="dxa" w:w="80"/>
+              <w:right w:type="dxa" w:w="120"/>
+            </w:tcMar>
+          </w:tcPr>
+          <w:p>
+            <w:r>
+              <w:rPr>
+                <w:rFonts w:ascii="Arial" w:cs="Arial" w:eastAsia="Arial" w:hAnsi="Arial"/>
+                <w:color w:val="222222"/>
+                <w:sz w:val="18"/>
+                <w:szCs w:val="18"/>
+              </w:rPr>
+              <w:t xml:space="preserve">Mesma figura legislativa com siglas diferentes entre legislaturas.</w:t>
+            </w:r>
+          </w:p>
+        </w:tc>
+      </w:tr>
+      <w:tr>
+        <w:tc>
+          <w:tcPr>
+            <w:tcW w:type="dxa" w:w="2400"/>
+            <w:tcBorders>
+              <w:top w:val="single" w:color="CCCCCC" w:sz="1"/>
+              <w:left w:val="single" w:color="CCCCCC" w:sz="1"/>
+              <w:bottom w:val="single" w:color="CCCCCC" w:sz="1"/>
+              <w:right w:val="single" w:color="CCCCCC" w:sz="1"/>
+            </w:tcBorders>
+            <w:tcMar>
+              <w:top w:type="dxa" w:w="80"/>
+              <w:left w:type="dxa" w:w="120"/>
+              <w:bottom w:type="dxa" w:w="80"/>
+              <w:right w:type="dxa" w:w="120"/>
+            </w:tcMar>
+          </w:tcPr>
+          <w:p>
+            <w:r>
+              <w:rPr>
+                <w:rFonts w:ascii="Arial" w:cs="Arial" w:eastAsia="Arial" w:hAnsi="Arial"/>
+                <w:color w:val="222222"/>
+                <w:sz w:val="18"/>
+                <w:szCs w:val="18"/>
+              </w:rPr>
+              <w:t xml:space="preserve">Temas leg. 56 sem tema</w:t>
+            </w:r>
+          </w:p>
+        </w:tc>
+        <w:tc>
+          <w:tcPr>
+            <w:tcW w:type="dxa" w:w="2000"/>
+            <w:tcBorders>
+              <w:top w:val="single" w:color="CCCCCC" w:sz="1"/>
+              <w:left w:val="single" w:color="CCCCCC" w:sz="1"/>
+              <w:bottom w:val="single" w:color="CCCCCC" w:sz="1"/>
+              <w:right w:val="single" w:color="CCCCCC" w:sz="1"/>
+            </w:tcBorders>
+            <w:tcMar>
+              <w:top w:type="dxa" w:w="80"/>
+              <w:left w:type="dxa" w:w="120"/>
+              <w:bottom w:type="dxa" w:w="80"/>
+              <w:right w:type="dxa" w:w="120"/>
+            </w:tcMar>
+          </w:tcPr>
+          <w:p>
+            <w:r>
+              <w:rPr>
+                <w:rFonts w:ascii="Arial" w:cs="Arial" w:eastAsia="Arial" w:hAnsi="Arial"/>
+                <w:color w:val="222222"/>
+                <w:sz w:val="18"/>
+                <w:szCs w:val="18"/>
+              </w:rPr>
+              <w:t xml:space="preserve">GPT como fallback opcional</w:t>
+            </w:r>
+          </w:p>
+        </w:tc>
+        <w:tc>
+          <w:tcPr>
+            <w:tcW w:type="dxa" w:w="4560"/>
+            <w:tcBorders>
+              <w:top w:val="single" w:color="CCCCCC" w:sz="1"/>
+              <w:left w:val="single" w:color="CCCCCC" w:sz="1"/>
+              <w:bottom w:val="single" w:color="CCCCCC" w:sz="1"/>
+              <w:right w:val="single" w:color="CCCCCC" w:sz="1"/>
+            </w:tcBorders>
+            <w:tcMar>
+              <w:top w:type="dxa" w:w="80"/>
+              <w:left w:type="dxa" w:w="120"/>
+              <w:bottom w:type="dxa" w:w="80"/>
+              <w:right w:type="dxa" w:w="120"/>
+            </w:tcMar>
+          </w:tcPr>
+          <w:p>
+            <w:r>
+              <w:rPr>
+                <w:rFonts w:ascii="Arial" w:cs="Arial" w:eastAsia="Arial" w:hAnsi="Arial"/>
+                <w:color w:val="222222"/>
+                <w:sz w:val="18"/>
+                <w:szCs w:val="18"/>
+              </w:rPr>
+              <w:t xml:space="preserve">Câmara atualizou retroativamente. Apenas ~50 props sem tema em abril/2026.</w:t>
+            </w:r>
+          </w:p>
+        </w:tc>
+      </w:tr>
+      <w:tr>
+        <w:tc>
+          <w:tcPr>
+            <w:tcW w:type="dxa" w:w="2400"/>
             <w:tcBorders>
               <w:top w:val="single" w:color="CCCCCC" w:sz="1"/>
               <w:left w:val="single" w:color="CCCCCC" w:sz="1"/>
@@ -3277,29 +5539,29 @@
         </w:tc>
         <w:tc>
           <w:tcPr>
-            <w:tcW w:type="dxa" w:w="2200"/>
-            <w:tcBorders>
-              <w:top w:val="single" w:color="CCCCCC" w:sz="1"/>
-              <w:left w:val="single" w:color="CCCCCC" w:sz="1"/>
-              <w:bottom w:val="single" w:color="CCCCCC" w:sz="1"/>
-              <w:right w:val="single" w:color="CCCCCC" w:sz="1"/>
-            </w:tcBorders>
-            <w:tcMar>
-              <w:top w:type="dxa" w:w="80"/>
-              <w:left w:type="dxa" w:w="120"/>
-              <w:bottom w:type="dxa" w:w="80"/>
-              <w:right w:type="dxa" w:w="120"/>
-            </w:tcMar>
-          </w:tcPr>
-          <w:p>
-            <w:r>
-              <w:rPr>
-                <w:rFonts w:ascii="Arial" w:cs="Arial" w:eastAsia="Arial" w:hAnsi="Arial"/>
-                <w:color w:val="222222"/>
-                <w:sz w:val="18"/>
-                <w:szCs w:val="18"/>
-              </w:rPr>
-              <w:t xml:space="preserve">Filtrar em 1_coletar.py (no raw)</w:t>
+            <w:tcW w:type="dxa" w:w="2000"/>
+            <w:tcBorders>
+              <w:top w:val="single" w:color="CCCCCC" w:sz="1"/>
+              <w:left w:val="single" w:color="CCCCCC" w:sz="1"/>
+              <w:bottom w:val="single" w:color="CCCCCC" w:sz="1"/>
+              <w:right w:val="single" w:color="CCCCCC" w:sz="1"/>
+            </w:tcBorders>
+            <w:tcMar>
+              <w:top w:type="dxa" w:w="80"/>
+              <w:left w:type="dxa" w:w="120"/>
+              <w:bottom w:type="dxa" w:w="80"/>
+              <w:right w:type="dxa" w:w="120"/>
+            </w:tcMar>
+          </w:tcPr>
+          <w:p>
+            <w:r>
+              <w:rPr>
+                <w:rFonts w:ascii="Arial" w:cs="Arial" w:eastAsia="Arial" w:hAnsi="Arial"/>
+                <w:color w:val="222222"/>
+                <w:sz w:val="18"/>
+                <w:szCs w:val="18"/>
+              </w:rPr>
+              <w:t xml:space="preserve">Filtrar em 1_coletar.py</w:t>
             </w:r>
           </w:p>
         </w:tc>
@@ -3327,7 +5589,93 @@
                 <w:sz w:val="18"/>
                 <w:szCs w:val="18"/>
               </w:rPr>
-              <w:t xml:space="preserve">Tipos são estáveis. Arquivos menores em todo o pipeline. Se mudar, basta re-rodar a coleta.</w:t>
+              <w:t xml:space="preserve">Tipos são estáveis. Arquivos menores em todo o pipeline.</w:t>
+            </w:r>
+          </w:p>
+        </w:tc>
+      </w:tr>
+      <w:tr>
+        <w:tc>
+          <w:tcPr>
+            <w:tcW w:type="dxa" w:w="2400"/>
+            <w:tcBorders>
+              <w:top w:val="single" w:color="CCCCCC" w:sz="1"/>
+              <w:left w:val="single" w:color="CCCCCC" w:sz="1"/>
+              <w:bottom w:val="single" w:color="CCCCCC" w:sz="1"/>
+              <w:right w:val="single" w:color="CCCCCC" w:sz="1"/>
+            </w:tcBorders>
+            <w:tcMar>
+              <w:top w:type="dxa" w:w="80"/>
+              <w:left w:type="dxa" w:w="120"/>
+              <w:bottom w:type="dxa" w:w="80"/>
+              <w:right w:type="dxa" w:w="120"/>
+            </w:tcMar>
+          </w:tcPr>
+          <w:p>
+            <w:r>
+              <w:rPr>
+                <w:rFonts w:ascii="Arial" w:cs="Arial" w:eastAsia="Arial" w:hAnsi="Arial"/>
+                <w:color w:val="222222"/>
+                <w:sz w:val="18"/>
+                <w:szCs w:val="18"/>
+              </w:rPr>
+              <w:t xml:space="preserve">Autores</w:t>
+            </w:r>
+          </w:p>
+        </w:tc>
+        <w:tc>
+          <w:tcPr>
+            <w:tcW w:type="dxa" w:w="2000"/>
+            <w:tcBorders>
+              <w:top w:val="single" w:color="CCCCCC" w:sz="1"/>
+              <w:left w:val="single" w:color="CCCCCC" w:sz="1"/>
+              <w:bottom w:val="single" w:color="CCCCCC" w:sz="1"/>
+              <w:right w:val="single" w:color="CCCCCC" w:sz="1"/>
+            </w:tcBorders>
+            <w:tcMar>
+              <w:top w:type="dxa" w:w="80"/>
+              <w:left w:type="dxa" w:w="120"/>
+              <w:bottom w:type="dxa" w:w="80"/>
+              <w:right w:type="dxa" w:w="120"/>
+            </w:tcMar>
+          </w:tcPr>
+          <w:p>
+            <w:r>
+              <w:rPr>
+                <w:rFonts w:ascii="Arial" w:cs="Arial" w:eastAsia="Arial" w:hAnsi="Arial"/>
+                <w:color w:val="222222"/>
+                <w:sz w:val="18"/>
+                <w:szCs w:val="18"/>
+              </w:rPr>
+              <w:t xml:space="preserve">Todos os tipos + coluna subset deputados</w:t>
+            </w:r>
+          </w:p>
+        </w:tc>
+        <w:tc>
+          <w:tcPr>
+            <w:tcW w:type="dxa" w:w="4560"/>
+            <w:tcBorders>
+              <w:top w:val="single" w:color="CCCCCC" w:sz="1"/>
+              <w:left w:val="single" w:color="CCCCCC" w:sz="1"/>
+              <w:bottom w:val="single" w:color="CCCCCC" w:sz="1"/>
+              <w:right w:val="single" w:color="CCCCCC" w:sz="1"/>
+            </w:tcBorders>
+            <w:tcMar>
+              <w:top w:type="dxa" w:w="80"/>
+              <w:left w:type="dxa" w:w="120"/>
+              <w:bottom w:type="dxa" w:w="80"/>
+              <w:right w:type="dxa" w:w="120"/>
+            </w:tcMar>
+          </w:tcPr>
+          <w:p>
+            <w:r>
+              <w:rPr>
+                <w:rFonts w:ascii="Arial" w:cs="Arial" w:eastAsia="Arial" w:hAnsi="Arial"/>
+                <w:color w:val="222222"/>
+                <w:sz w:val="18"/>
+                <w:szCs w:val="18"/>
+              </w:rPr>
+              <w:t xml:space="preserve">Mantém flexibilidade. Dashboard usa autores_deputados diretamente.</w:t>
             </w:r>
           </w:p>
         </w:tc>
@@ -4171,7 +6519,7 @@
           <w:sz w:val="20"/>
           <w:szCs w:val="20"/>
         </w:rPr>
-        <w:t xml:space="preserve">Hoje o pipeline re-baixa e reprocessa tudo a cada rodada. A otimização prevista:</w:t>
+        <w:t xml:space="preserve">Hoje o pipeline re-baixa e reprocessa tudo a cada rodada (~50-60 min no 2_enriquecer.py). A otimização prevista:</w:t>
       </w:r>
     </w:p>
     <w:p>
@@ -4233,6 +6581,79 @@
     </w:p>
     <w:p>
       <w:pPr>
+        <w:spacing w:after="80" w:before="80"/>
+        <w:ind w:left="360"/>
+      </w:pPr>
+      <w:r>
+        <w:rPr>
+          <w:rFonts w:ascii="Arial" w:cs="Arial" w:eastAsia="Arial" w:hAnsi="Arial"/>
+          <w:i/>
+          <w:iCs/>
+          <w:color w:val="7F4F00"/>
+          <w:sz w:val="18"/>
+          <w:szCs w:val="18"/>
+        </w:rPr>
+        <w:t xml:space="preserve">⚠ A unidade de delta é o grupo. Uma mudança num membro implica recolapsar o grupo inteiro.</w:t>
+      </w:r>
+    </w:p>
+    <w:p>
+      <w:pPr>
+        <w:spacing w:after="80" w:before="80"/>
+        <w:ind w:left="360"/>
+      </w:pPr>
+      <w:r>
+        <w:rPr>
+          <w:rFonts w:ascii="Arial" w:cs="Arial" w:eastAsia="Arial" w:hAnsi="Arial"/>
+          <w:i/>
+          <w:iCs/>
+          <w:color w:val="7F4F00"/>
+          <w:sz w:val="18"/>
+          <w:szCs w:val="18"/>
+        </w:rPr>
+        <w:t xml:space="preserve">⚠ Requer que o state/ultima_atualizacao.json registre um timestamp por rodada. Já está previsto no config.py.</w:t>
+      </w:r>
+    </w:p>
+    <w:p>
+      <w:pPr>
+        <w:spacing w:after="0" w:before="120"/>
+      </w:pPr>
+      <w:r>
+        <w:t xml:space="preserve"/>
+      </w:r>
+    </w:p>
+    <w:p>
+      <w:pPr>
+        <w:pStyle w:val="Heading2"/>
+        <w:spacing w:after="120" w:before="280"/>
+      </w:pPr>
+      <w:r>
+        <w:rPr>
+          <w:rFonts w:ascii="Arial" w:cs="Arial" w:eastAsia="Arial" w:hAnsi="Arial"/>
+          <w:b/>
+          <w:bCs/>
+          <w:color w:val="2E75B6"/>
+          <w:sz w:val="26"/>
+          <w:szCs w:val="26"/>
+        </w:rPr>
+        <w:t xml:space="preserve">7.2 Votações</w:t>
+      </w:r>
+    </w:p>
+    <w:p>
+      <w:pPr>
+        <w:spacing w:after="60" w:before="60"/>
+      </w:pPr>
+      <w:r>
+        <w:rPr>
+          <w:rFonts w:ascii="Arial" w:cs="Arial" w:eastAsia="Arial" w:hAnsi="Arial"/>
+          <w:color w:val="222222"/>
+          <w:sz w:val="20"/>
+          <w:szCs w:val="20"/>
+        </w:rPr>
+        <w:t xml:space="preserve">O endpoint /proposicoes/{id}/tramitacoes da API da Câmara é enganoso — retorna eventos de todas as proposições relacionadas, não só da proposição em questão.</w:t>
+      </w:r>
+    </w:p>
+    <w:p>
+      <w:pPr>
         <w:pStyle w:val="ListParagraph"/>
         <w:numPr>
           <w:ilvl w:val="0"/>
@@ -4247,119 +6668,7 @@
           <w:sz w:val="20"/>
           <w:szCs w:val="20"/>
         </w:rPr>
-        <w:t xml:space="preserve">Proposições e grupos sem mudança são pulados</w:t>
-      </w:r>
-    </w:p>
-    <w:p>
-      <w:pPr>
-        <w:spacing w:after="80" w:before="80"/>
-        <w:ind w:left="360"/>
-      </w:pPr>
-      <w:r>
-        <w:rPr>
-          <w:rFonts w:ascii="Arial" w:cs="Arial" w:eastAsia="Arial" w:hAnsi="Arial"/>
-          <w:i/>
-          <w:iCs/>
-          <w:color w:val="7F4F00"/>
-          <w:sz w:val="18"/>
-          <w:szCs w:val="18"/>
-        </w:rPr>
-        <w:t xml:space="preserve">⚠ Requer que o state/ultima_atualizacao.json registre um timestamp por rodada. Já está previsto no config.py.</w:t>
-      </w:r>
-    </w:p>
-    <w:p>
-      <w:pPr>
-        <w:spacing w:after="80" w:before="80"/>
-        <w:ind w:left="360"/>
-      </w:pPr>
-      <w:r>
-        <w:rPr>
-          <w:rFonts w:ascii="Arial" w:cs="Arial" w:eastAsia="Arial" w:hAnsi="Arial"/>
-          <w:i/>
-          <w:iCs/>
-          <w:color w:val="7F4F00"/>
-          <w:sz w:val="18"/>
-          <w:szCs w:val="18"/>
-        </w:rPr>
-        <w:t xml:space="preserve">⚠ A unidade de delta é o grupo, não a proposição. Uma mudança num membro implica recolapsar o grupo inteiro.</w:t>
-      </w:r>
-    </w:p>
-    <w:p>
-      <w:pPr>
-        <w:spacing w:after="0" w:before="120"/>
-      </w:pPr>
-      <w:r>
-        <w:t xml:space="preserve"/>
-      </w:r>
-    </w:p>
-    <w:p>
-      <w:pPr>
-        <w:pStyle w:val="Heading2"/>
-        <w:spacing w:after="120" w:before="280"/>
-      </w:pPr>
-      <w:r>
-        <w:rPr>
-          <w:rFonts w:ascii="Arial" w:cs="Arial" w:eastAsia="Arial" w:hAnsi="Arial"/>
-          <w:b/>
-          <w:bCs/>
-          <w:color w:val="2E75B6"/>
-          <w:sz w:val="26"/>
-          <w:szCs w:val="26"/>
-        </w:rPr>
-        <w:t xml:space="preserve">7.2 Proposições com ementa quase idêntica mas não apensadas</w:t>
-      </w:r>
-    </w:p>
-    <w:p>
-      <w:pPr>
-        <w:spacing w:after="60" w:before="60"/>
-      </w:pPr>
-      <w:r>
-        <w:rPr>
-          <w:rFonts w:ascii="Arial" w:cs="Arial" w:eastAsia="Arial" w:hAnsi="Arial"/>
-          <w:color w:val="222222"/>
-          <w:sz w:val="20"/>
-          <w:szCs w:val="20"/>
-        </w:rPr>
-        <w:t xml:space="preserve">Existe um subconjunto pequeno de proposições que tratam do mesmo assunto mas por algum motivo não foram formalmente apensadas. Decisão atual: deixar separadas. Ver §5 (Decisões Metodológicas).</w:t>
-      </w:r>
-    </w:p>
-    <w:p>
-      <w:pPr>
-        <w:spacing w:after="0" w:before="120"/>
-      </w:pPr>
-      <w:r>
-        <w:t xml:space="preserve"/>
-      </w:r>
-    </w:p>
-    <w:p>
-      <w:pPr>
-        <w:pStyle w:val="Heading2"/>
-        <w:spacing w:after="120" w:before="280"/>
-      </w:pPr>
-      <w:r>
-        <w:rPr>
-          <w:rFonts w:ascii="Arial" w:cs="Arial" w:eastAsia="Arial" w:hAnsi="Arial"/>
-          <w:b/>
-          <w:bCs/>
-          <w:color w:val="2E75B6"/>
-          <w:sz w:val="26"/>
-          <w:szCs w:val="26"/>
-        </w:rPr>
-        <w:t xml:space="preserve">7.3 Votações</w:t>
-      </w:r>
-    </w:p>
-    <w:p>
-      <w:pPr>
-        <w:spacing w:after="60" w:before="60"/>
-      </w:pPr>
-      <w:r>
-        <w:rPr>
-          <w:rFonts w:ascii="Arial" w:cs="Arial" w:eastAsia="Arial" w:hAnsi="Arial"/>
-          <w:color w:val="222222"/>
-          <w:sz w:val="20"/>
-          <w:szCs w:val="20"/>
-        </w:rPr>
-        <w:t xml:space="preserve">O endpoint /proposicoes/{id}/tramitacoes da API da Câmara é enganoso — retorna eventos de todas as proposições relacionadas, não só da proposição em questão.</w:t>
+        <w:t xml:space="preserve">Problema: log de tramitação mistura eventos da proposição principal com requerimentos e apensadas</w:t>
       </w:r>
     </w:p>
     <w:p>
@@ -4378,7 +6687,7 @@
           <w:sz w:val="20"/>
           <w:szCs w:val="20"/>
         </w:rPr>
-        <w:t xml:space="preserve">Problema: log de tramitação mistura eventos da proposição principal com requerimentos e apensadas</w:t>
+        <w:t xml:space="preserve">Regra promissora para passagem pelo Senado: codTipoTramitacao em {128, 1510, 1518, 1519} + 'senado' no campo despacho</w:t>
       </w:r>
     </w:p>
     <w:p>
@@ -4397,7 +6706,133 @@
           <w:sz w:val="20"/>
           <w:szCs w:val="20"/>
         </w:rPr>
-        <w:t xml:space="preserve">Regra promissora para passagem pelo Senado: codTipoTramitacao em {128, 1510, 1518, 1519} + 'senado' no campo despacho</w:t>
+        <w:t xml:space="preserve">Ainda não há solução definitiva para extrair votação nominal (quem votou como)</w:t>
+      </w:r>
+    </w:p>
+    <w:p>
+      <w:pPr>
+        <w:spacing w:after="80" w:before="80"/>
+        <w:ind w:left="360"/>
+      </w:pPr>
+      <w:r>
+        <w:rPr>
+          <w:rFonts w:ascii="Arial" w:cs="Arial" w:eastAsia="Arial" w:hAnsi="Arial"/>
+          <w:i/>
+          <w:iCs/>
+          <w:color w:val="7F4F00"/>
+          <w:sz w:val="18"/>
+          <w:szCs w:val="18"/>
+        </w:rPr>
+        <w:t xml:space="preserve">⚠ Não iniciar implementação de votações antes de a base de proposições estar totalmente consolidada.</w:t>
+      </w:r>
+    </w:p>
+    <w:p>
+      <w:pPr>
+        <w:spacing w:after="0" w:before="120"/>
+      </w:pPr>
+      <w:r>
+        <w:t xml:space="preserve"/>
+      </w:r>
+    </w:p>
+    <w:p>
+      <w:pPr>
+        <w:pStyle w:val="Heading2"/>
+        <w:spacing w:after="120" w:before="280"/>
+      </w:pPr>
+      <w:r>
+        <w:rPr>
+          <w:rFonts w:ascii="Arial" w:cs="Arial" w:eastAsia="Arial" w:hAnsi="Arial"/>
+          <w:b/>
+          <w:bCs/>
+          <w:color w:val="2E75B6"/>
+          <w:sz w:val="26"/>
+          <w:szCs w:val="26"/>
+        </w:rPr>
+        <w:t xml:space="preserve">7.3 Migração para Supabase</w:t>
+      </w:r>
+    </w:p>
+    <w:p>
+      <w:pPr>
+        <w:spacing w:after="60" w:before="60"/>
+      </w:pPr>
+      <w:r>
+        <w:rPr>
+          <w:rFonts w:ascii="Arial" w:cs="Arial" w:eastAsia="Arial" w:hAnsi="Arial"/>
+          <w:color w:val="222222"/>
+          <w:sz w:val="20"/>
+          <w:szCs w:val="20"/>
+        </w:rPr>
+        <w:t xml:space="preserve">Hoje a base final fica em parquet local. Quando o dashboard for ao ar, adicionar no final do 5_consolidar.py um upload para o Supabase. Aproximadamente 10 linhas de código, não afeta nenhum outro script.</w:t>
+      </w:r>
+    </w:p>
+    <w:p>
+      <w:pPr>
+        <w:spacing w:after="0" w:before="120"/>
+      </w:pPr>
+      <w:r>
+        <w:t xml:space="preserve"/>
+      </w:r>
+    </w:p>
+    <w:p>
+      <w:pPr>
+        <w:pStyle w:val="Heading2"/>
+        <w:spacing w:after="120" w:before="280"/>
+      </w:pPr>
+      <w:r>
+        <w:rPr>
+          <w:rFonts w:ascii="Arial" w:cs="Arial" w:eastAsia="Arial" w:hAnsi="Arial"/>
+          <w:b/>
+          <w:bCs/>
+          <w:color w:val="2E75B6"/>
+          <w:sz w:val="26"/>
+          <w:szCs w:val="26"/>
+        </w:rPr>
+        <w:t xml:space="preserve">7.4 Proposições com ementa quase idêntica mas não apensadas</w:t>
+      </w:r>
+    </w:p>
+    <w:p>
+      <w:pPr>
+        <w:spacing w:after="60" w:before="60"/>
+      </w:pPr>
+      <w:r>
+        <w:rPr>
+          <w:rFonts w:ascii="Arial" w:cs="Arial" w:eastAsia="Arial" w:hAnsi="Arial"/>
+          <w:color w:val="222222"/>
+          <w:sz w:val="20"/>
+          <w:szCs w:val="20"/>
+        </w:rPr>
+        <w:t xml:space="preserve">Subconjunto pequeno de proposições que tratam do mesmo assunto mas não foram formalmente apensadas. Decisão atual: deixar separadas. Ver §5.</w:t>
+      </w:r>
+    </w:p>
+    <w:p>
+      <w:pPr>
+        <w:pBdr>
+          <w:bottom w:val="single" w:color="CCCCCC" w:sz="2" w:space="1"/>
+        </w:pBdr>
+        <w:spacing w:after="160" w:before="160"/>
+      </w:pPr>
+      <w:r>
+        <w:t xml:space="preserve"/>
+      </w:r>
+    </w:p>
+    <w:p>
+      <w:pPr>
+        <w:pStyle w:val="Heading1"/>
+        <w:pBdr>
+          <w:bottom w:val="single" w:color="2E75B6" w:sz="6" w:space="1"/>
+        </w:pBdr>
+        <w:spacing w:after="160" w:before="400"/>
+      </w:pPr>
+      <w:r>
+        <w:rPr>
+          <w:rFonts w:ascii="Arial" w:cs="Arial" w:eastAsia="Arial" w:hAnsi="Arial"/>
+          <w:b/>
+          <w:bCs/>
+          <w:color w:val="1F4E79"/>
+          <w:sz w:val="32"/>
+          <w:szCs w:val="32"/>
+        </w:rPr>
+        <w:t xml:space="preserve">8. Problemas Conhecidos da API da Câmara</w:t>
       </w:r>
     </w:p>
     <w:p>
@@ -4416,94 +6851,7 @@
           <w:sz w:val="20"/>
           <w:szCs w:val="20"/>
         </w:rPr>
-        <w:t xml:space="preserve">Ainda não há solução definitiva para extrair votação nominal (quem votou como)</w:t>
-      </w:r>
-    </w:p>
-    <w:p>
-      <w:pPr>
-        <w:spacing w:after="80" w:before="80"/>
-        <w:ind w:left="360"/>
-      </w:pPr>
-      <w:r>
-        <w:rPr>
-          <w:rFonts w:ascii="Arial" w:cs="Arial" w:eastAsia="Arial" w:hAnsi="Arial"/>
-          <w:i/>
-          <w:iCs/>
-          <w:color w:val="7F4F00"/>
-          <w:sz w:val="18"/>
-          <w:szCs w:val="18"/>
-        </w:rPr>
-        <w:t xml:space="preserve">⚠ Não iniciar implementação de votações antes de a base de proposições estar totalmente consolidada.</w:t>
-      </w:r>
-    </w:p>
-    <w:p>
-      <w:pPr>
-        <w:spacing w:after="0" w:before="120"/>
-      </w:pPr>
-      <w:r>
-        <w:t xml:space="preserve"/>
-      </w:r>
-    </w:p>
-    <w:p>
-      <w:pPr>
-        <w:pStyle w:val="Heading2"/>
-        <w:spacing w:after="120" w:before="280"/>
-      </w:pPr>
-      <w:r>
-        <w:rPr>
-          <w:rFonts w:ascii="Arial" w:cs="Arial" w:eastAsia="Arial" w:hAnsi="Arial"/>
-          <w:b/>
-          <w:bCs/>
-          <w:color w:val="2E75B6"/>
-          <w:sz w:val="26"/>
-          <w:szCs w:val="26"/>
-        </w:rPr>
-        <w:t xml:space="preserve">7.4 Migração para Supabase</w:t>
-      </w:r>
-    </w:p>
-    <w:p>
-      <w:pPr>
-        <w:spacing w:after="60" w:before="60"/>
-      </w:pPr>
-      <w:r>
-        <w:rPr>
-          <w:rFonts w:ascii="Arial" w:cs="Arial" w:eastAsia="Arial" w:hAnsi="Arial"/>
-          <w:color w:val="222222"/>
-          <w:sz w:val="20"/>
-          <w:szCs w:val="20"/>
-        </w:rPr>
-        <w:t xml:space="preserve">Hoje a base final fica em parquet local. Quando o dashboard for ao ar, adicionar no final do 5_consolidar.py um upload para o Supabase. Aproximadamente 10 linhas de código, não afeta nenhum outro script.</w:t>
-      </w:r>
-    </w:p>
-    <w:p>
-      <w:pPr>
-        <w:pBdr>
-          <w:bottom w:val="single" w:color="CCCCCC" w:sz="2" w:space="1"/>
-        </w:pBdr>
-        <w:spacing w:after="160" w:before="160"/>
-      </w:pPr>
-      <w:r>
-        <w:t xml:space="preserve"/>
-      </w:r>
-    </w:p>
-    <w:p>
-      <w:pPr>
-        <w:pStyle w:val="Heading1"/>
-        <w:pBdr>
-          <w:bottom w:val="single" w:color="2E75B6" w:sz="6" w:space="1"/>
-        </w:pBdr>
-        <w:spacing w:after="160" w:before="400"/>
-      </w:pPr>
-      <w:r>
-        <w:rPr>
-          <w:rFonts w:ascii="Arial" w:cs="Arial" w:eastAsia="Arial" w:hAnsi="Arial"/>
-          <w:b/>
-          <w:bCs/>
-          <w:color w:val="1F4E79"/>
-          <w:sz w:val="32"/>
-          <w:szCs w:val="32"/>
-        </w:rPr>
-        <w:t xml:space="preserve">8. Problemas Conhecidos da API da Câmara</w:t>
+        <w:t xml:space="preserve">O endpoint /tramitacoes retorna eventos de proposições relacionadas, não só da proposição consultada</w:t>
       </w:r>
     </w:p>
     <w:p>
@@ -4522,7 +6870,7 @@
           <w:sz w:val="20"/>
           <w:szCs w:val="20"/>
         </w:rPr>
-        <w:t xml:space="preserve">O endpoint /tramitacoes retorna eventos de proposições relacionadas, não só da proposição consultada</w:t>
+        <w:t xml:space="preserve">Dados de legislaturas antigas (antes de 2015) são incompletos — temas, autores e ultimoStatus ficam cada vez mais vazios</w:t>
       </w:r>
     </w:p>
     <w:p>
@@ -4541,7 +6889,7 @@
           <w:sz w:val="20"/>
           <w:szCs w:val="20"/>
         </w:rPr>
-        <w:t xml:space="preserve">Dados de legislaturas antigas (antes de 2015) são incompletos — temas, autores com idDeputado e ultimoStatus ficam cada vez mais vazios</w:t>
+        <w:t xml:space="preserve">Proposições sem ultimoStatus na API existem — tratadas como Arquivadas na classificação</w:t>
       </w:r>
     </w:p>
     <w:p>
@@ -4560,7 +6908,7 @@
           <w:sz w:val="20"/>
           <w:szCs w:val="20"/>
         </w:rPr>
-        <w:t xml:space="preserve">Proposições sem ultimoStatus na API existem — tratadas como Arquivadas na classificação</w:t>
+        <w:t xml:space="preserve">PDC (leg. 56) e PDL (leg. 57) são a mesma figura legislativa com siglas diferentes</w:t>
       </w:r>
     </w:p>
     <w:p>
@@ -4579,7 +6927,7 @@
           <w:sz w:val="20"/>
           <w:szCs w:val="20"/>
         </w:rPr>
-        <w:t xml:space="preserve">PDC (leg. 56) e PDL (leg. 57) são a mesma figura legislativa com siglas diferentes</w:t>
+        <w:t xml:space="preserve">Rate limiting não documentado — usar sleep de 0.05s entre requisições e retry com backoff exponencial</w:t>
       </w:r>
     </w:p>
     <w:p>
@@ -4598,7 +6946,7 @@
           <w:sz w:val="20"/>
           <w:szCs w:val="20"/>
         </w:rPr>
-        <w:t xml:space="preserve">Rate limiting não documentado — usar sleep de 0.05s entre requisições e retry com backoff exponencial</w:t>
+        <w:t xml:space="preserve">A Câmara atualiza dados retroativamente sem aviso — ex: temas da leg. 56 preenchidos retroativamente (descoberto em abril/2026)</w:t>
       </w:r>
     </w:p>
     <w:p>
@@ -4617,7 +6965,7 @@
           <w:sz w:val="20"/>
           <w:szCs w:val="20"/>
         </w:rPr>
-        <w:t xml:space="preserve">A Câmara atualiza dados retroativamente sem aviso — ex: temas da leg. 56 foram preenchidos retroativamente (descoberto em abril/2026)</w:t>
+        <w:t xml:space="preserve">2_enriquecer.py demora mais de 1h para rodar no conjunto completo (~41k proposições)</w:t>
       </w:r>
     </w:p>
     <w:p>
@@ -4645,7 +6993,7 @@
           <w:sz w:val="18"/>
           <w:szCs w:val="18"/>
         </w:rPr>
-        <w:t xml:space="preserve">Última atualização: 16/04/2026</w:t>
+        <w:t xml:space="preserve">Última atualização: 17/04/2026</w:t>
       </w:r>
     </w:p>
     <w:sectPr>

</xml_diff>